<commit_message>
Se modifica TP10 y TP11
</commit_message>
<xml_diff>
--- a/Trabajos/Prácticos/TP_9/TP9 -Testing-TaxiMobile.docx
+++ b/Trabajos/Prácticos/TP_9/TP9 -Testing-TaxiMobile.docx
@@ -13,12 +13,10 @@
         <w:rPr>
           <w:rFonts w:cs="Calibri"/>
         </w:rPr>
-      </w:r>
-      <w:r>
         <mc:AlternateContent>
           <mc:Choice Requires="wps">
             <w:drawing>
-              <wp:anchor behindDoc="0" distT="0" distB="0" distL="114300" distR="114300" simplePos="0" locked="0" layoutInCell="0" allowOverlap="1" relativeHeight="2">
+              <wp:anchor behindDoc="0" distT="0" distB="0" distL="113665" distR="114300" simplePos="0" locked="0" layoutInCell="0" allowOverlap="1" relativeHeight="2">
                 <wp:simplePos x="0" y="0"/>
                 <wp:positionH relativeFrom="margin">
                   <wp:align>center</wp:align>
@@ -26,26 +24,33 @@
                 <wp:positionV relativeFrom="paragraph">
                   <wp:posOffset>-756920</wp:posOffset>
                 </wp:positionV>
-                <wp:extent cx="10262235" cy="6728460"/>
+                <wp:extent cx="10262235" cy="6882130"/>
                 <wp:effectExtent l="0" t="0" r="0" b="0"/>
                 <wp:wrapSquare wrapText="bothSides"/>
                 <wp:docPr id="1" name="Marco1"/>
                 <a:graphic xmlns:a="http://schemas.openxmlformats.org/drawingml/2006/main">
                   <a:graphicData uri="http://schemas.microsoft.com/office/word/2010/wordprocessingShape">
                     <wps:wsp>
-                      <wps:cNvSpPr txBox="1"/>
+                      <wps:cNvSpPr/>
                       <wps:spPr>
                         <a:xfrm>
                           <a:off x="0" y="0"/>
-                          <a:ext cx="10262235" cy="6728460"/>
+                          <a:ext cx="10262160" cy="6882120"/>
                         </a:xfrm>
-                        <a:prstGeom prst="rect"/>
-                        <a:solidFill>
-                          <a:srgbClr val="FFFFFF">
-                            <a:alpha val="0"/>
-                          </a:srgbClr>
-                        </a:solidFill>
+                        <a:prstGeom prst="rect">
+                          <a:avLst/>
+                        </a:prstGeom>
+                        <a:noFill/>
+                        <a:ln w="0">
+                          <a:noFill/>
+                        </a:ln>
                       </wps:spPr>
+                      <wps:style>
+                        <a:lnRef idx="0"/>
+                        <a:fillRef idx="0"/>
+                        <a:effectRef idx="0"/>
+                        <a:fontRef idx="minor"/>
+                      </wps:style>
                       <wps:txbx>
                         <w:txbxContent>
                           <w:p>
@@ -113,6 +118,7 @@
                                   <w:pPr>
                                     <w:pStyle w:val="Normal"/>
                                     <w:widowControl/>
+                                    <w:suppressAutoHyphens w:val="true"/>
                                     <w:spacing w:before="0" w:after="0"/>
                                     <w:jc w:val="center"/>
                                     <w:rPr>
@@ -149,6 +155,7 @@
                                   <w:pPr>
                                     <w:pStyle w:val="Normal"/>
                                     <w:widowControl/>
+                                    <w:suppressAutoHyphens w:val="true"/>
                                     <w:spacing w:before="0" w:after="0"/>
                                     <w:jc w:val="center"/>
                                     <w:cnfStyle w:val="100000000000" w:firstRow="1" w:lastRow="0" w:firstColumn="0" w:lastColumn="0" w:oddVBand="0" w:evenVBand="0" w:oddHBand="0" w:evenHBand="0" w:firstRowFirstColumn="0" w:firstRowLastColumn="0" w:lastRowFirstColumn="0" w:lastRowLastColumn="0"/>
@@ -186,6 +193,7 @@
                                   <w:pPr>
                                     <w:pStyle w:val="Normal"/>
                                     <w:widowControl/>
+                                    <w:suppressAutoHyphens w:val="true"/>
                                     <w:spacing w:before="0" w:after="0"/>
                                     <w:jc w:val="center"/>
                                     <w:cnfStyle w:val="100000000000" w:firstRow="1" w:lastRow="0" w:firstColumn="0" w:lastColumn="0" w:oddVBand="0" w:evenVBand="0" w:oddHBand="0" w:evenHBand="0" w:firstRowFirstColumn="0" w:firstRowLastColumn="0" w:lastRowFirstColumn="0" w:lastRowLastColumn="0"/>
@@ -223,6 +231,7 @@
                                   <w:pPr>
                                     <w:pStyle w:val="Normal"/>
                                     <w:widowControl/>
+                                    <w:suppressAutoHyphens w:val="true"/>
                                     <w:spacing w:before="0" w:after="0"/>
                                     <w:jc w:val="center"/>
                                     <w:cnfStyle w:val="100000000000" w:firstRow="1" w:lastRow="0" w:firstColumn="0" w:lastColumn="0" w:oddVBand="0" w:evenVBand="0" w:oddHBand="0" w:evenHBand="0" w:firstRowFirstColumn="0" w:firstRowLastColumn="0" w:lastRowFirstColumn="0" w:lastRowLastColumn="0"/>
@@ -260,6 +269,7 @@
                                   <w:pPr>
                                     <w:pStyle w:val="Normal"/>
                                     <w:widowControl/>
+                                    <w:suppressAutoHyphens w:val="true"/>
                                     <w:spacing w:before="0" w:after="0"/>
                                     <w:jc w:val="center"/>
                                     <w:cnfStyle w:val="100000000000" w:firstRow="1" w:lastRow="0" w:firstColumn="0" w:lastColumn="0" w:oddVBand="0" w:evenVBand="0" w:oddHBand="0" w:evenHBand="0" w:firstRowFirstColumn="0" w:firstRowLastColumn="0" w:lastRowFirstColumn="0" w:lastRowLastColumn="0"/>
@@ -297,6 +307,7 @@
                                   <w:pPr>
                                     <w:pStyle w:val="Normal"/>
                                     <w:widowControl/>
+                                    <w:suppressAutoHyphens w:val="true"/>
                                     <w:spacing w:before="0" w:after="0"/>
                                     <w:jc w:val="center"/>
                                     <w:cnfStyle w:val="100000000000" w:firstRow="1" w:lastRow="0" w:firstColumn="0" w:lastColumn="0" w:oddVBand="0" w:evenVBand="0" w:oddHBand="0" w:evenHBand="0" w:firstRowFirstColumn="0" w:firstRowLastColumn="0" w:lastRowFirstColumn="0" w:lastRowLastColumn="0"/>
@@ -341,6 +352,7 @@
                                   <w:pPr>
                                     <w:pStyle w:val="Normal"/>
                                     <w:widowControl/>
+                                    <w:suppressAutoHyphens w:val="true"/>
                                     <w:spacing w:before="0" w:after="0"/>
                                     <w:jc w:val="center"/>
                                     <w:rPr>
@@ -383,6 +395,7 @@
                                   <w:pPr>
                                     <w:pStyle w:val="Normal"/>
                                     <w:widowControl/>
+                                    <w:suppressAutoHyphens w:val="true"/>
                                     <w:spacing w:before="0" w:after="0"/>
                                     <w:jc w:val="center"/>
                                     <w:cnfStyle w:val="000000100000" w:firstRow="0" w:lastRow="0" w:firstColumn="0" w:lastColumn="0" w:oddVBand="0" w:evenVBand="0" w:oddHBand="1" w:evenHBand="0" w:firstRowFirstColumn="0" w:firstRowLastColumn="0" w:lastRowFirstColumn="0" w:lastRowLastColumn="0"/>
@@ -421,6 +434,7 @@
                                 <w:p>
                                   <w:pPr>
                                     <w:pStyle w:val="Normal"/>
+                                    <w:suppressAutoHyphens w:val="true"/>
                                     <w:bidi w:val="0"/>
                                     <w:jc w:val="center"/>
                                     <w:rPr>
@@ -450,6 +464,7 @@
                                   <w:pPr>
                                     <w:pStyle w:val="Normal"/>
                                     <w:widowControl/>
+                                    <w:suppressAutoHyphens w:val="true"/>
                                     <w:spacing w:before="0" w:after="0"/>
                                     <w:jc w:val="center"/>
                                     <w:cnfStyle w:val="000000100000" w:firstRow="0" w:lastRow="0" w:firstColumn="0" w:lastColumn="0" w:oddVBand="0" w:evenVBand="0" w:oddHBand="1" w:evenHBand="0" w:firstRowFirstColumn="0" w:firstRowLastColumn="0" w:lastRowFirstColumn="0" w:lastRowLastColumn="0"/>
@@ -487,6 +502,9 @@
                                 <w:p>
                                   <w:pPr>
                                     <w:pStyle w:val="Contenidodelatabla"/>
+                                    <w:widowControl/>
+                                    <w:suppressAutoHyphens w:val="true"/>
+                                    <w:spacing w:before="0" w:after="0"/>
                                     <w:ind w:hanging="0" w:left="0" w:right="0"/>
                                     <w:jc w:val="center"/>
                                     <w:rPr>
@@ -497,9 +515,11 @@
                                   </w:pPr>
                                   <w:r>
                                     <w:rPr>
-                                      <w:rFonts w:ascii="Arial" w:hAnsi="Arial"/>
-                                      <w:sz w:val="18"/>
-                                      <w:szCs w:val="18"/>
+                                      <w:rFonts w:eastAsia="Calibri" w:cs="" w:ascii="Arial" w:hAnsi="Arial"/>
+                                      <w:kern w:val="0"/>
+                                      <w:sz w:val="18"/>
+                                      <w:szCs w:val="18"/>
+                                      <w:lang w:val="es-ES" w:eastAsia="es-ES" w:bidi="ar-SA"/>
                                     </w:rPr>
                                     <w:t>El Administrador de la Central debe estar logueado en el sistema.</w:t>
                                   </w:r>
@@ -507,6 +527,9 @@
                                 <w:p>
                                   <w:pPr>
                                     <w:pStyle w:val="Contenidodelatabla"/>
+                                    <w:widowControl/>
+                                    <w:suppressAutoHyphens w:val="true"/>
+                                    <w:spacing w:before="0" w:after="0"/>
                                     <w:ind w:hanging="0" w:left="0" w:right="0"/>
                                     <w:jc w:val="center"/>
                                     <w:rPr>
@@ -517,15 +540,20 @@
                                   </w:pPr>
                                   <w:r>
                                     <w:rPr>
-                                      <w:rFonts w:ascii="Arial" w:hAnsi="Arial"/>
-                                      <w:sz w:val="18"/>
-                                      <w:szCs w:val="18"/>
+                                      <w:rFonts w:eastAsia="Calibri" w:cs="" w:ascii="Arial" w:hAnsi="Arial"/>
+                                      <w:kern w:val="0"/>
+                                      <w:sz w:val="18"/>
+                                      <w:szCs w:val="18"/>
+                                      <w:lang w:val="es-ES" w:eastAsia="es-ES" w:bidi="ar-SA"/>
                                     </w:rPr>
                                   </w:r>
                                 </w:p>
                                 <w:p>
                                   <w:pPr>
                                     <w:pStyle w:val="Contenidodelatabla"/>
+                                    <w:widowControl/>
+                                    <w:suppressAutoHyphens w:val="true"/>
+                                    <w:spacing w:before="0" w:after="0"/>
                                     <w:ind w:hanging="0" w:left="0" w:right="0"/>
                                     <w:jc w:val="center"/>
                                     <w:rPr>
@@ -536,9 +564,11 @@
                                   </w:pPr>
                                   <w:r>
                                     <w:rPr>
-                                      <w:rFonts w:ascii="Arial" w:hAnsi="Arial"/>
-                                      <w:sz w:val="18"/>
-                                      <w:szCs w:val="18"/>
+                                      <w:rFonts w:eastAsia="Calibri" w:cs="" w:ascii="Arial" w:hAnsi="Arial"/>
+                                      <w:kern w:val="0"/>
+                                      <w:sz w:val="18"/>
+                                      <w:szCs w:val="18"/>
+                                      <w:lang w:val="es-ES" w:eastAsia="es-ES" w:bidi="ar-SA"/>
                                     </w:rPr>
                                     <w:t>Los taxis deben estar registrados en alguna central con el servicio taxi mobile.</w:t>
                                   </w:r>
@@ -546,6 +576,9 @@
                                 <w:p>
                                   <w:pPr>
                                     <w:pStyle w:val="Contenidodelatabla"/>
+                                    <w:widowControl/>
+                                    <w:suppressAutoHyphens w:val="true"/>
+                                    <w:spacing w:before="0" w:after="0"/>
                                     <w:ind w:hanging="0" w:left="0" w:right="0"/>
                                     <w:jc w:val="center"/>
                                     <w:rPr>
@@ -556,15 +589,20 @@
                                   </w:pPr>
                                   <w:r>
                                     <w:rPr>
-                                      <w:rFonts w:ascii="Arial" w:hAnsi="Arial"/>
-                                      <w:sz w:val="18"/>
-                                      <w:szCs w:val="18"/>
+                                      <w:rFonts w:eastAsia="Calibri" w:cs="" w:ascii="Arial" w:hAnsi="Arial"/>
+                                      <w:kern w:val="0"/>
+                                      <w:sz w:val="18"/>
+                                      <w:szCs w:val="18"/>
+                                      <w:lang w:val="es-ES" w:eastAsia="es-ES" w:bidi="ar-SA"/>
                                     </w:rPr>
                                   </w:r>
                                 </w:p>
                                 <w:p>
                                   <w:pPr>
                                     <w:pStyle w:val="Contenidodelatabla"/>
+                                    <w:widowControl/>
+                                    <w:suppressAutoHyphens w:val="true"/>
+                                    <w:spacing w:before="0" w:after="0"/>
                                     <w:ind w:hanging="0" w:left="0" w:right="0"/>
                                     <w:jc w:val="center"/>
                                     <w:rPr>
@@ -575,9 +613,11 @@
                                   </w:pPr>
                                   <w:r>
                                     <w:rPr>
-                                      <w:rFonts w:ascii="Arial" w:hAnsi="Arial"/>
-                                      <w:sz w:val="18"/>
-                                      <w:szCs w:val="18"/>
+                                      <w:rFonts w:eastAsia="Calibri" w:cs="" w:ascii="Arial" w:hAnsi="Arial"/>
+                                      <w:kern w:val="0"/>
+                                      <w:sz w:val="18"/>
+                                      <w:szCs w:val="18"/>
+                                      <w:lang w:val="es-ES" w:eastAsia="es-ES" w:bidi="ar-SA"/>
                                     </w:rPr>
                                     <w:t>Los taxis deben estar registrados en la aplicación.</w:t>
                                   </w:r>
@@ -585,6 +625,9 @@
                                 <w:p>
                                   <w:pPr>
                                     <w:pStyle w:val="Contenidodelatabla"/>
+                                    <w:widowControl/>
+                                    <w:suppressAutoHyphens w:val="true"/>
+                                    <w:spacing w:before="0" w:after="0"/>
                                     <w:ind w:hanging="0" w:left="0" w:right="0"/>
                                     <w:jc w:val="center"/>
                                     <w:rPr>
@@ -595,15 +638,20 @@
                                   </w:pPr>
                                   <w:r>
                                     <w:rPr>
-                                      <w:rFonts w:ascii="Arial" w:hAnsi="Arial"/>
-                                      <w:sz w:val="18"/>
-                                      <w:szCs w:val="18"/>
+                                      <w:rFonts w:eastAsia="Calibri" w:cs="" w:ascii="Arial" w:hAnsi="Arial"/>
+                                      <w:kern w:val="0"/>
+                                      <w:sz w:val="18"/>
+                                      <w:szCs w:val="18"/>
+                                      <w:lang w:val="es-ES" w:eastAsia="es-ES" w:bidi="ar-SA"/>
                                     </w:rPr>
                                   </w:r>
                                 </w:p>
                                 <w:p>
                                   <w:pPr>
                                     <w:pStyle w:val="Contenidodelatabla"/>
+                                    <w:widowControl/>
+                                    <w:suppressAutoHyphens w:val="true"/>
+                                    <w:spacing w:before="0" w:after="0"/>
                                     <w:ind w:hanging="0" w:left="0" w:right="0"/>
                                     <w:jc w:val="center"/>
                                     <w:rPr>
@@ -614,9 +662,11 @@
                                   </w:pPr>
                                   <w:r>
                                     <w:rPr>
-                                      <w:rFonts w:ascii="Arial" w:hAnsi="Arial"/>
-                                      <w:sz w:val="18"/>
-                                      <w:szCs w:val="18"/>
+                                      <w:rFonts w:eastAsia="Calibri" w:cs="" w:ascii="Arial" w:hAnsi="Arial"/>
+                                      <w:kern w:val="0"/>
+                                      <w:sz w:val="18"/>
+                                      <w:szCs w:val="18"/>
+                                      <w:lang w:val="es-ES" w:eastAsia="es-ES" w:bidi="ar-SA"/>
                                     </w:rPr>
                                     <w:t>Los taxis deben tener habilitada la localización por GPS.</w:t>
                                   </w:r>
@@ -637,6 +687,9 @@
                                 <w:p>
                                   <w:pPr>
                                     <w:pStyle w:val="Contenidodelatabla"/>
+                                    <w:widowControl/>
+                                    <w:suppressAutoHyphens w:val="true"/>
+                                    <w:spacing w:before="0" w:after="0"/>
                                     <w:ind w:hanging="0" w:left="0" w:right="0"/>
                                     <w:jc w:val="center"/>
                                     <w:rPr>
@@ -647,9 +700,11 @@
                                   </w:pPr>
                                   <w:r>
                                     <w:rPr>
-                                      <w:rFonts w:ascii="Arial" w:hAnsi="Arial"/>
-                                      <w:sz w:val="18"/>
-                                      <w:szCs w:val="18"/>
+                                      <w:rFonts w:eastAsia="Calibri" w:cs="" w:ascii="Arial" w:hAnsi="Arial"/>
+                                      <w:kern w:val="0"/>
+                                      <w:sz w:val="18"/>
+                                      <w:szCs w:val="18"/>
+                                      <w:lang w:val="es-ES" w:eastAsia="es-ES" w:bidi="ar-SA"/>
                                     </w:rPr>
                                     <w:t>1. El Administrador de la Central selecciona la opción “Visualizar Mapa”</w:t>
                                     <w:br/>
@@ -673,6 +728,9 @@
                                 <w:p>
                                   <w:pPr>
                                     <w:pStyle w:val="Contenidodelatabla"/>
+                                    <w:widowControl/>
+                                    <w:suppressAutoHyphens w:val="true"/>
+                                    <w:spacing w:before="0" w:after="0"/>
                                     <w:ind w:hanging="0" w:left="0" w:right="0"/>
                                     <w:jc w:val="center"/>
                                     <w:rPr>
@@ -683,11 +741,13 @@
                                   </w:pPr>
                                   <w:r>
                                     <w:rPr>
-                                      <w:rFonts w:ascii="Arial" w:hAnsi="Arial"/>
-                                      <w:sz w:val="18"/>
-                                      <w:szCs w:val="18"/>
-                                    </w:rPr>
-                                    <w:t xml:space="preserve">El sistema muestra el mapa con distintos colores los taxis: ocupados, los libres, los solicitados y los que están fuera de servicio. </w:t>
+                                      <w:rFonts w:eastAsia="Calibri" w:cs="" w:ascii="Arial" w:hAnsi="Arial"/>
+                                      <w:kern w:val="0"/>
+                                      <w:sz w:val="18"/>
+                                      <w:szCs w:val="18"/>
+                                      <w:lang w:val="es-ES" w:eastAsia="es-ES" w:bidi="ar-SA"/>
+                                    </w:rPr>
+                                    <w:t>El sistema muestra el mapa con distintos colores los taxis: ocupados, los libres, los solicitados y los que están fuera de servicio.</w:t>
                                   </w:r>
                                 </w:p>
                               </w:tc>
@@ -714,6 +774,7 @@
                                   <w:pPr>
                                     <w:pStyle w:val="Normal"/>
                                     <w:widowControl/>
+                                    <w:suppressAutoHyphens w:val="true"/>
                                     <w:spacing w:before="0" w:after="0"/>
                                     <w:jc w:val="center"/>
                                     <w:rPr>
@@ -756,6 +817,7 @@
                                   <w:pPr>
                                     <w:pStyle w:val="Normal"/>
                                     <w:widowControl/>
+                                    <w:suppressAutoHyphens w:val="true"/>
                                     <w:spacing w:before="0" w:after="0"/>
                                     <w:jc w:val="center"/>
                                     <w:cnfStyle w:val="000000100000" w:firstRow="0" w:lastRow="0" w:firstColumn="0" w:lastColumn="0" w:oddVBand="0" w:evenVBand="0" w:oddHBand="1" w:evenHBand="0" w:firstRowFirstColumn="0" w:firstRowLastColumn="0" w:lastRowFirstColumn="0" w:lastRowLastColumn="0"/>
@@ -775,7 +837,7 @@
                                       <w:szCs w:val="18"/>
                                       <w:lang w:bidi="ar-SA"/>
                                     </w:rPr>
-                                    <w:t>MEDIA</w:t>
+                                    <w:t>ALTA</w:t>
                                   </w:r>
                                 </w:p>
                               </w:tc>
@@ -794,6 +856,7 @@
                                 <w:p>
                                   <w:pPr>
                                     <w:pStyle w:val="Normal"/>
+                                    <w:suppressAutoHyphens w:val="true"/>
                                     <w:bidi w:val="0"/>
                                     <w:jc w:val="center"/>
                                     <w:rPr>
@@ -827,6 +890,9 @@
                                 <w:p>
                                   <w:pPr>
                                     <w:pStyle w:val="Contenidodelatabla"/>
+                                    <w:widowControl/>
+                                    <w:suppressAutoHyphens w:val="true"/>
+                                    <w:spacing w:before="0" w:after="0"/>
                                     <w:ind w:hanging="0" w:left="0" w:right="0"/>
                                     <w:jc w:val="center"/>
                                     <w:rPr>
@@ -837,9 +903,11 @@
                                   </w:pPr>
                                   <w:r>
                                     <w:rPr>
-                                      <w:rFonts w:ascii="Arial" w:hAnsi="Arial"/>
-                                      <w:sz w:val="18"/>
-                                      <w:szCs w:val="18"/>
+                                      <w:rFonts w:eastAsia="Calibri" w:cs="" w:ascii="Arial" w:hAnsi="Arial"/>
+                                      <w:kern w:val="0"/>
+                                      <w:sz w:val="18"/>
+                                      <w:szCs w:val="18"/>
+                                      <w:lang w:val="es-ES" w:eastAsia="es-ES" w:bidi="ar-SA"/>
                                     </w:rPr>
                                     <w:t>El taxi esta en estado solicitado y tiene asociado un pasajero</w:t>
                                   </w:r>
@@ -860,6 +928,9 @@
                                 <w:p>
                                   <w:pPr>
                                     <w:pStyle w:val="Contenidodelatabla"/>
+                                    <w:widowControl/>
+                                    <w:suppressAutoHyphens w:val="true"/>
+                                    <w:spacing w:before="0" w:after="0"/>
                                     <w:ind w:hanging="0" w:left="0" w:right="0"/>
                                     <w:jc w:val="center"/>
                                     <w:rPr>
@@ -870,9 +941,11 @@
                                   </w:pPr>
                                   <w:r>
                                     <w:rPr>
-                                      <w:rFonts w:ascii="Arial" w:hAnsi="Arial"/>
-                                      <w:sz w:val="18"/>
-                                      <w:szCs w:val="18"/>
+                                      <w:rFonts w:eastAsia="Calibri" w:cs="" w:ascii="Arial" w:hAnsi="Arial"/>
+                                      <w:kern w:val="0"/>
+                                      <w:sz w:val="18"/>
+                                      <w:szCs w:val="18"/>
+                                      <w:lang w:val="es-ES" w:eastAsia="es-ES" w:bidi="ar-SA"/>
                                     </w:rPr>
                                     <w:t>1. El administrador de la Central selecciona la opción “Visualizar Mapa”</w:t>
                                   </w:r>
@@ -880,6 +953,9 @@
                                 <w:p>
                                   <w:pPr>
                                     <w:pStyle w:val="Contenidodelatabla"/>
+                                    <w:widowControl/>
+                                    <w:suppressAutoHyphens w:val="true"/>
+                                    <w:spacing w:before="0" w:after="0"/>
                                     <w:ind w:hanging="0" w:left="0" w:right="0"/>
                                     <w:jc w:val="center"/>
                                     <w:rPr>
@@ -890,15 +966,20 @@
                                   </w:pPr>
                                   <w:r>
                                     <w:rPr>
-                                      <w:rFonts w:ascii="Arial" w:hAnsi="Arial"/>
-                                      <w:sz w:val="18"/>
-                                      <w:szCs w:val="18"/>
+                                      <w:rFonts w:eastAsia="Calibri" w:cs="" w:ascii="Arial" w:hAnsi="Arial"/>
+                                      <w:kern w:val="0"/>
+                                      <w:sz w:val="18"/>
+                                      <w:szCs w:val="18"/>
+                                      <w:lang w:val="es-ES" w:eastAsia="es-ES" w:bidi="ar-SA"/>
                                     </w:rPr>
                                   </w:r>
                                 </w:p>
                                 <w:p>
                                   <w:pPr>
                                     <w:pStyle w:val="Contenidodelatabla"/>
+                                    <w:widowControl/>
+                                    <w:suppressAutoHyphens w:val="true"/>
+                                    <w:spacing w:before="0" w:after="0"/>
                                     <w:ind w:hanging="0" w:left="0" w:right="0"/>
                                     <w:jc w:val="center"/>
                                     <w:rPr>
@@ -909,11 +990,13 @@
                                   </w:pPr>
                                   <w:r>
                                     <w:rPr>
-                                      <w:rFonts w:ascii="Arial" w:hAnsi="Arial"/>
-                                      <w:sz w:val="18"/>
-                                      <w:szCs w:val="18"/>
-                                    </w:rPr>
-                                    <w:t xml:space="preserve">2. El Administrador de la Central pasa el mouse por encima del taxi </w:t>
+                                      <w:rFonts w:eastAsia="Calibri" w:cs="" w:ascii="Arial" w:hAnsi="Arial"/>
+                                      <w:kern w:val="0"/>
+                                      <w:sz w:val="18"/>
+                                      <w:szCs w:val="18"/>
+                                      <w:lang w:val="es-ES" w:eastAsia="es-ES" w:bidi="ar-SA"/>
+                                    </w:rPr>
+                                    <w:t>2. El Administrador de la Central pasa el mouse por encima del taxi</w:t>
                                   </w:r>
                                 </w:p>
                               </w:tc>
@@ -932,6 +1015,9 @@
                                 <w:p>
                                   <w:pPr>
                                     <w:pStyle w:val="Contenidodelatabla"/>
+                                    <w:widowControl/>
+                                    <w:suppressAutoHyphens w:val="true"/>
+                                    <w:spacing w:before="0" w:after="0"/>
                                     <w:ind w:hanging="0" w:left="0" w:right="0"/>
                                     <w:jc w:val="center"/>
                                     <w:rPr>
@@ -942,9 +1028,11 @@
                                   </w:pPr>
                                   <w:r>
                                     <w:rPr>
-                                      <w:rFonts w:ascii="Arial" w:hAnsi="Arial"/>
-                                      <w:sz w:val="18"/>
-                                      <w:szCs w:val="18"/>
+                                      <w:rFonts w:eastAsia="Calibri" w:cs="" w:ascii="Arial" w:hAnsi="Arial"/>
+                                      <w:kern w:val="0"/>
+                                      <w:sz w:val="18"/>
+                                      <w:szCs w:val="18"/>
+                                      <w:lang w:val="es-ES" w:eastAsia="es-ES" w:bidi="ar-SA"/>
                                     </w:rPr>
                                     <w:t>El sistema muestra los datos del pasajero (nombre, apellido y teléfono), sin mostrar la información del viaje.</w:t>
                                   </w:r>
@@ -973,6 +1061,7 @@
                                   <w:pPr>
                                     <w:pStyle w:val="Normal"/>
                                     <w:widowControl/>
+                                    <w:suppressAutoHyphens w:val="true"/>
                                     <w:spacing w:before="0" w:after="0"/>
                                     <w:jc w:val="center"/>
                                     <w:rPr>
@@ -1015,6 +1104,7 @@
                                   <w:pPr>
                                     <w:pStyle w:val="Normal"/>
                                     <w:widowControl/>
+                                    <w:suppressAutoHyphens w:val="true"/>
                                     <w:spacing w:before="0" w:after="0"/>
                                     <w:jc w:val="center"/>
                                     <w:cnfStyle w:val="000000100000" w:firstRow="0" w:lastRow="0" w:firstColumn="0" w:lastColumn="0" w:oddVBand="0" w:evenVBand="0" w:oddHBand="1" w:evenHBand="0" w:firstRowFirstColumn="0" w:firstRowLastColumn="0" w:lastRowFirstColumn="0" w:lastRowLastColumn="0"/>
@@ -1034,7 +1124,7 @@
                                       <w:szCs w:val="18"/>
                                       <w:lang w:bidi="ar-SA"/>
                                     </w:rPr>
-                                    <w:t>MEDIA</w:t>
+                                    <w:t>ALTA</w:t>
                                   </w:r>
                                 </w:p>
                               </w:tc>
@@ -1053,6 +1143,7 @@
                                 <w:p>
                                   <w:pPr>
                                     <w:pStyle w:val="Normal"/>
+                                    <w:suppressAutoHyphens w:val="true"/>
                                     <w:bidi w:val="0"/>
                                     <w:jc w:val="center"/>
                                     <w:rPr>
@@ -1086,6 +1177,9 @@
                                 <w:p>
                                   <w:pPr>
                                     <w:pStyle w:val="Contenidodelatabla"/>
+                                    <w:widowControl/>
+                                    <w:suppressAutoHyphens w:val="true"/>
+                                    <w:spacing w:before="0" w:after="0"/>
                                     <w:ind w:hanging="0" w:left="0" w:right="0"/>
                                     <w:jc w:val="center"/>
                                     <w:rPr>
@@ -1096,9 +1190,11 @@
                                   </w:pPr>
                                   <w:r>
                                     <w:rPr>
-                                      <w:rFonts w:ascii="Arial" w:hAnsi="Arial"/>
-                                      <w:sz w:val="18"/>
-                                      <w:szCs w:val="18"/>
+                                      <w:rFonts w:eastAsia="Calibri" w:cs="" w:ascii="Arial" w:hAnsi="Arial"/>
+                                      <w:kern w:val="0"/>
+                                      <w:sz w:val="18"/>
+                                      <w:szCs w:val="18"/>
+                                      <w:lang w:val="es-ES" w:eastAsia="es-ES" w:bidi="ar-SA"/>
                                     </w:rPr>
                                     <w:t>El taxi esta en estado ocupado, tiene un pasajero y un recorrido asociado</w:t>
                                   </w:r>
@@ -1119,6 +1215,9 @@
                                 <w:p>
                                   <w:pPr>
                                     <w:pStyle w:val="Contenidodelatabla"/>
+                                    <w:widowControl/>
+                                    <w:suppressAutoHyphens w:val="true"/>
+                                    <w:spacing w:before="0" w:after="0"/>
                                     <w:ind w:hanging="0" w:left="0" w:right="0"/>
                                     <w:jc w:val="center"/>
                                     <w:rPr>
@@ -1129,9 +1228,11 @@
                                   </w:pPr>
                                   <w:r>
                                     <w:rPr>
-                                      <w:rFonts w:ascii="Arial" w:hAnsi="Arial"/>
-                                      <w:sz w:val="18"/>
-                                      <w:szCs w:val="18"/>
+                                      <w:rFonts w:eastAsia="Calibri" w:cs="" w:ascii="Arial" w:hAnsi="Arial"/>
+                                      <w:kern w:val="0"/>
+                                      <w:sz w:val="18"/>
+                                      <w:szCs w:val="18"/>
+                                      <w:lang w:val="es-ES" w:eastAsia="es-ES" w:bidi="ar-SA"/>
                                     </w:rPr>
                                     <w:t>1. El Administrador de la Central selecciona la opción “Visualizar Mapa”</w:t>
                                   </w:r>
@@ -1139,6 +1240,9 @@
                                 <w:p>
                                   <w:pPr>
                                     <w:pStyle w:val="Contenidodelatabla"/>
+                                    <w:widowControl/>
+                                    <w:suppressAutoHyphens w:val="true"/>
+                                    <w:spacing w:before="0" w:after="0"/>
                                     <w:ind w:hanging="0" w:left="0" w:right="0"/>
                                     <w:jc w:val="center"/>
                                     <w:rPr>
@@ -1149,15 +1253,20 @@
                                   </w:pPr>
                                   <w:r>
                                     <w:rPr>
-                                      <w:rFonts w:ascii="Arial" w:hAnsi="Arial"/>
-                                      <w:sz w:val="18"/>
-                                      <w:szCs w:val="18"/>
+                                      <w:rFonts w:eastAsia="Calibri" w:cs="" w:ascii="Arial" w:hAnsi="Arial"/>
+                                      <w:kern w:val="0"/>
+                                      <w:sz w:val="18"/>
+                                      <w:szCs w:val="18"/>
+                                      <w:lang w:val="es-ES" w:eastAsia="es-ES" w:bidi="ar-SA"/>
                                     </w:rPr>
                                   </w:r>
                                 </w:p>
                                 <w:p>
                                   <w:pPr>
                                     <w:pStyle w:val="Contenidodelatabla"/>
+                                    <w:widowControl/>
+                                    <w:suppressAutoHyphens w:val="true"/>
+                                    <w:spacing w:before="0" w:after="0"/>
                                     <w:ind w:hanging="0" w:left="0" w:right="0"/>
                                     <w:jc w:val="center"/>
                                     <w:rPr>
@@ -1168,11 +1277,13 @@
                                   </w:pPr>
                                   <w:r>
                                     <w:rPr>
-                                      <w:rFonts w:ascii="Arial" w:hAnsi="Arial"/>
-                                      <w:sz w:val="18"/>
-                                      <w:szCs w:val="18"/>
-                                    </w:rPr>
-                                    <w:t xml:space="preserve">2. El Administrador de la Central pasa el mouse por encima del taxi </w:t>
+                                      <w:rFonts w:eastAsia="Calibri" w:cs="" w:ascii="Arial" w:hAnsi="Arial"/>
+                                      <w:kern w:val="0"/>
+                                      <w:sz w:val="18"/>
+                                      <w:szCs w:val="18"/>
+                                      <w:lang w:val="es-ES" w:eastAsia="es-ES" w:bidi="ar-SA"/>
+                                    </w:rPr>
+                                    <w:t>2. El Administrador de la Central pasa el mouse por encima del taxi</w:t>
                                   </w:r>
                                 </w:p>
                               </w:tc>
@@ -1191,6 +1302,9 @@
                                 <w:p>
                                   <w:pPr>
                                     <w:pStyle w:val="Contenidodelatabla"/>
+                                    <w:widowControl/>
+                                    <w:suppressAutoHyphens w:val="true"/>
+                                    <w:spacing w:before="0" w:after="0"/>
                                     <w:ind w:hanging="0" w:left="0" w:right="0"/>
                                     <w:jc w:val="center"/>
                                     <w:rPr>
@@ -1201,9 +1315,11 @@
                                   </w:pPr>
                                   <w:r>
                                     <w:rPr>
-                                      <w:rFonts w:ascii="Arial" w:hAnsi="Arial"/>
-                                      <w:sz w:val="18"/>
-                                      <w:szCs w:val="18"/>
+                                      <w:rFonts w:eastAsia="Calibri" w:cs="" w:ascii="Arial" w:hAnsi="Arial"/>
+                                      <w:kern w:val="0"/>
+                                      <w:sz w:val="18"/>
+                                      <w:szCs w:val="18"/>
+                                      <w:lang w:val="es-ES" w:eastAsia="es-ES" w:bidi="ar-SA"/>
                                     </w:rPr>
                                     <w:t>El sistema muestra los datos del pasajero (nombre, apellido y teléfono) y muestra la información del recorrido (hora de inicio y costo).</w:t>
                                   </w:r>
@@ -1232,6 +1348,7 @@
                                   <w:pPr>
                                     <w:pStyle w:val="Normal"/>
                                     <w:widowControl/>
+                                    <w:suppressAutoHyphens w:val="true"/>
                                     <w:spacing w:before="0" w:after="0"/>
                                     <w:jc w:val="center"/>
                                     <w:rPr>
@@ -1274,6 +1391,7 @@
                                   <w:pPr>
                                     <w:pStyle w:val="Normal"/>
                                     <w:widowControl/>
+                                    <w:suppressAutoHyphens w:val="true"/>
                                     <w:spacing w:before="0" w:after="0"/>
                                     <w:jc w:val="center"/>
                                     <w:cnfStyle w:val="000000100000" w:firstRow="0" w:lastRow="0" w:firstColumn="0" w:lastColumn="0" w:oddVBand="0" w:evenVBand="0" w:oddHBand="1" w:evenHBand="0" w:firstRowFirstColumn="0" w:firstRowLastColumn="0" w:lastRowFirstColumn="0" w:lastRowLastColumn="0"/>
@@ -1312,6 +1430,7 @@
                                 <w:p>
                                   <w:pPr>
                                     <w:pStyle w:val="Normal"/>
+                                    <w:suppressAutoHyphens w:val="true"/>
                                     <w:bidi w:val="0"/>
                                     <w:jc w:val="center"/>
                                     <w:rPr>
@@ -1326,23 +1445,7 @@
                                       <w:sz w:val="18"/>
                                       <w:szCs w:val="18"/>
                                     </w:rPr>
-                                    <w:t xml:space="preserve">Filtrar </w:t>
-                                  </w:r>
-                                  <w:r>
-                                    <w:rPr>
-                                      <w:rFonts w:ascii="Arial" w:hAnsi="Arial"/>
-                                      <w:sz w:val="18"/>
-                                      <w:szCs w:val="18"/>
-                                    </w:rPr>
-                                    <w:t>taxis</w:t>
-                                  </w:r>
-                                  <w:r>
-                                    <w:rPr>
-                                      <w:rFonts w:ascii="Arial" w:hAnsi="Arial"/>
-                                      <w:sz w:val="18"/>
-                                      <w:szCs w:val="18"/>
-                                    </w:rPr>
-                                    <w:t xml:space="preserve"> por barrio existente </w:t>
+                                    <w:t>Filtrar taxis por barrio existente</w:t>
                                   </w:r>
                                 </w:p>
                               </w:tc>
@@ -1361,6 +1464,9 @@
                                 <w:p>
                                   <w:pPr>
                                     <w:pStyle w:val="Contenidodelatabla"/>
+                                    <w:widowControl/>
+                                    <w:suppressAutoHyphens w:val="true"/>
+                                    <w:spacing w:before="0" w:after="0"/>
                                     <w:ind w:hanging="0" w:left="0" w:right="0"/>
                                     <w:jc w:val="center"/>
                                     <w:rPr>
@@ -1371,9 +1477,11 @@
                                   </w:pPr>
                                   <w:r>
                                     <w:rPr>
-                                      <w:rFonts w:ascii="Arial" w:hAnsi="Arial"/>
-                                      <w:sz w:val="18"/>
-                                      <w:szCs w:val="18"/>
+                                      <w:rFonts w:eastAsia="Calibri" w:cs="" w:ascii="Arial" w:hAnsi="Arial"/>
+                                      <w:kern w:val="0"/>
+                                      <w:sz w:val="18"/>
+                                      <w:szCs w:val="18"/>
+                                      <w:lang w:val="es-ES" w:eastAsia="es-ES" w:bidi="ar-SA"/>
                                     </w:rPr>
                                     <w:t>El barrio debe estar registrado en el sistema</w:t>
                                   </w:r>
@@ -1394,6 +1502,9 @@
                                 <w:p>
                                   <w:pPr>
                                     <w:pStyle w:val="Contenidodelatabla"/>
+                                    <w:widowControl/>
+                                    <w:suppressAutoHyphens w:val="true"/>
+                                    <w:spacing w:before="0" w:after="0"/>
                                     <w:ind w:hanging="0" w:left="0" w:right="0"/>
                                     <w:jc w:val="center"/>
                                     <w:rPr>
@@ -1404,9 +1515,11 @@
                                   </w:pPr>
                                   <w:r>
                                     <w:rPr>
-                                      <w:rFonts w:ascii="Arial" w:hAnsi="Arial"/>
-                                      <w:sz w:val="18"/>
-                                      <w:szCs w:val="18"/>
+                                      <w:rFonts w:eastAsia="Calibri" w:cs="" w:ascii="Arial" w:hAnsi="Arial"/>
+                                      <w:kern w:val="0"/>
+                                      <w:sz w:val="18"/>
+                                      <w:szCs w:val="18"/>
+                                      <w:lang w:val="es-ES" w:eastAsia="es-ES" w:bidi="ar-SA"/>
                                     </w:rPr>
                                     <w:t>1. El Administrador de la Central selecciona la opción “Visualizar Mapa”</w:t>
                                   </w:r>
@@ -1414,6 +1527,9 @@
                                 <w:p>
                                   <w:pPr>
                                     <w:pStyle w:val="Contenidodelatabla"/>
+                                    <w:widowControl/>
+                                    <w:suppressAutoHyphens w:val="true"/>
+                                    <w:spacing w:before="0" w:after="0"/>
                                     <w:ind w:hanging="0" w:left="0" w:right="0"/>
                                     <w:jc w:val="center"/>
                                     <w:rPr>
@@ -1424,15 +1540,20 @@
                                   </w:pPr>
                                   <w:r>
                                     <w:rPr>
-                                      <w:rFonts w:ascii="Arial" w:hAnsi="Arial"/>
-                                      <w:sz w:val="18"/>
-                                      <w:szCs w:val="18"/>
+                                      <w:rFonts w:eastAsia="Calibri" w:cs="" w:ascii="Arial" w:hAnsi="Arial"/>
+                                      <w:kern w:val="0"/>
+                                      <w:sz w:val="18"/>
+                                      <w:szCs w:val="18"/>
+                                      <w:lang w:val="es-ES" w:eastAsia="es-ES" w:bidi="ar-SA"/>
                                     </w:rPr>
                                   </w:r>
                                 </w:p>
                                 <w:p>
                                   <w:pPr>
                                     <w:pStyle w:val="Contenidodelatabla"/>
+                                    <w:widowControl/>
+                                    <w:suppressAutoHyphens w:val="true"/>
+                                    <w:spacing w:before="0" w:after="0"/>
                                     <w:ind w:hanging="0" w:left="0" w:right="0"/>
                                     <w:jc w:val="center"/>
                                     <w:rPr>
@@ -1443,9 +1564,11 @@
                                   </w:pPr>
                                   <w:r>
                                     <w:rPr>
-                                      <w:rFonts w:ascii="Arial" w:hAnsi="Arial"/>
-                                      <w:sz w:val="18"/>
-                                      <w:szCs w:val="18"/>
+                                      <w:rFonts w:eastAsia="Calibri" w:cs="" w:ascii="Arial" w:hAnsi="Arial"/>
+                                      <w:kern w:val="0"/>
+                                      <w:sz w:val="18"/>
+                                      <w:szCs w:val="18"/>
+                                      <w:lang w:val="es-ES" w:eastAsia="es-ES" w:bidi="ar-SA"/>
                                     </w:rPr>
                                     <w:t>2. El sistema muestra la opción para filtrar la visualización por “Barrio”.</w:t>
                                   </w:r>
@@ -1453,6 +1576,9 @@
                                 <w:p>
                                   <w:pPr>
                                     <w:pStyle w:val="Contenidodelatabla"/>
+                                    <w:widowControl/>
+                                    <w:suppressAutoHyphens w:val="true"/>
+                                    <w:spacing w:before="0" w:after="0"/>
                                     <w:ind w:hanging="0" w:left="0" w:right="0"/>
                                     <w:jc w:val="center"/>
                                     <w:rPr>
@@ -1463,15 +1589,20 @@
                                   </w:pPr>
                                   <w:r>
                                     <w:rPr>
-                                      <w:rFonts w:ascii="Arial" w:hAnsi="Arial"/>
-                                      <w:sz w:val="18"/>
-                                      <w:szCs w:val="18"/>
+                                      <w:rFonts w:eastAsia="Calibri" w:cs="" w:ascii="Arial" w:hAnsi="Arial"/>
+                                      <w:kern w:val="0"/>
+                                      <w:sz w:val="18"/>
+                                      <w:szCs w:val="18"/>
+                                      <w:lang w:val="es-ES" w:eastAsia="es-ES" w:bidi="ar-SA"/>
                                     </w:rPr>
                                   </w:r>
                                 </w:p>
                                 <w:p>
                                   <w:pPr>
                                     <w:pStyle w:val="Contenidodelatabla"/>
+                                    <w:widowControl/>
+                                    <w:suppressAutoHyphens w:val="true"/>
+                                    <w:spacing w:before="0" w:after="0"/>
                                     <w:ind w:hanging="0" w:left="0" w:right="0"/>
                                     <w:jc w:val="center"/>
                                     <w:rPr>
@@ -1482,9 +1613,11 @@
                                   </w:pPr>
                                   <w:r>
                                     <w:rPr>
-                                      <w:rFonts w:ascii="Arial" w:hAnsi="Arial"/>
-                                      <w:sz w:val="18"/>
-                                      <w:szCs w:val="18"/>
+                                      <w:rFonts w:eastAsia="Calibri" w:cs="" w:ascii="Arial" w:hAnsi="Arial"/>
+                                      <w:kern w:val="0"/>
+                                      <w:sz w:val="18"/>
+                                      <w:szCs w:val="18"/>
+                                      <w:lang w:val="es-ES" w:eastAsia="es-ES" w:bidi="ar-SA"/>
                                     </w:rPr>
                                     <w:t>3. El sistema solicita ingresar el nombre del barrio.</w:t>
                                   </w:r>
@@ -1492,6 +1625,9 @@
                                 <w:p>
                                   <w:pPr>
                                     <w:pStyle w:val="Contenidodelatabla"/>
+                                    <w:widowControl/>
+                                    <w:suppressAutoHyphens w:val="true"/>
+                                    <w:spacing w:before="0" w:after="0"/>
                                     <w:ind w:hanging="0" w:left="0" w:right="0"/>
                                     <w:jc w:val="center"/>
                                     <w:rPr>
@@ -1502,15 +1638,20 @@
                                   </w:pPr>
                                   <w:r>
                                     <w:rPr>
-                                      <w:rFonts w:ascii="Arial" w:hAnsi="Arial"/>
-                                      <w:sz w:val="18"/>
-                                      <w:szCs w:val="18"/>
+                                      <w:rFonts w:eastAsia="Calibri" w:cs="" w:ascii="Arial" w:hAnsi="Arial"/>
+                                      <w:kern w:val="0"/>
+                                      <w:sz w:val="18"/>
+                                      <w:szCs w:val="18"/>
+                                      <w:lang w:val="es-ES" w:eastAsia="es-ES" w:bidi="ar-SA"/>
                                     </w:rPr>
                                   </w:r>
                                 </w:p>
                                 <w:p>
                                   <w:pPr>
                                     <w:pStyle w:val="Contenidodelatabla"/>
+                                    <w:widowControl/>
+                                    <w:suppressAutoHyphens w:val="true"/>
+                                    <w:spacing w:before="0" w:after="0"/>
                                     <w:ind w:hanging="0" w:left="0" w:right="0"/>
                                     <w:jc w:val="center"/>
                                     <w:rPr>
@@ -1521,9 +1662,11 @@
                                   </w:pPr>
                                   <w:r>
                                     <w:rPr>
-                                      <w:rFonts w:ascii="Arial" w:hAnsi="Arial"/>
-                                      <w:sz w:val="18"/>
-                                      <w:szCs w:val="18"/>
+                                      <w:rFonts w:eastAsia="Calibri" w:cs="" w:ascii="Arial" w:hAnsi="Arial"/>
+                                      <w:kern w:val="0"/>
+                                      <w:sz w:val="18"/>
+                                      <w:szCs w:val="18"/>
+                                      <w:lang w:val="es-ES" w:eastAsia="es-ES" w:bidi="ar-SA"/>
                                     </w:rPr>
                                     <w:t>4. El Administrador de la Central ingresa el nombre del barrio.</w:t>
                                   </w:r>
@@ -1531,6 +1674,9 @@
                                 <w:p>
                                   <w:pPr>
                                     <w:pStyle w:val="Contenidodelatabla"/>
+                                    <w:widowControl/>
+                                    <w:suppressAutoHyphens w:val="true"/>
+                                    <w:spacing w:before="0" w:after="0"/>
                                     <w:ind w:hanging="0" w:left="0" w:right="0"/>
                                     <w:jc w:val="center"/>
                                     <w:rPr>
@@ -1541,15 +1687,20 @@
                                   </w:pPr>
                                   <w:r>
                                     <w:rPr>
-                                      <w:rFonts w:ascii="Arial" w:hAnsi="Arial"/>
-                                      <w:sz w:val="18"/>
-                                      <w:szCs w:val="18"/>
+                                      <w:rFonts w:eastAsia="Calibri" w:cs="" w:ascii="Arial" w:hAnsi="Arial"/>
+                                      <w:kern w:val="0"/>
+                                      <w:sz w:val="18"/>
+                                      <w:szCs w:val="18"/>
+                                      <w:lang w:val="es-ES" w:eastAsia="es-ES" w:bidi="ar-SA"/>
                                     </w:rPr>
                                   </w:r>
                                 </w:p>
                                 <w:p>
                                   <w:pPr>
                                     <w:pStyle w:val="Contenidodelatabla"/>
+                                    <w:widowControl/>
+                                    <w:suppressAutoHyphens w:val="true"/>
+                                    <w:spacing w:before="0" w:after="0"/>
                                     <w:ind w:hanging="0" w:left="0" w:right="0"/>
                                     <w:jc w:val="center"/>
                                     <w:rPr>
@@ -1560,19 +1711,13 @@
                                   </w:pPr>
                                   <w:r>
                                     <w:rPr>
-                                      <w:rFonts w:ascii="Arial" w:hAnsi="Arial"/>
-                                      <w:sz w:val="18"/>
-                                      <w:szCs w:val="18"/>
-                                    </w:rPr>
-                                    <w:t xml:space="preserve">5. El sistema </w:t>
-                                  </w:r>
-                                  <w:r>
-                                    <w:rPr>
-                                      <w:rFonts w:ascii="Arial" w:hAnsi="Arial"/>
-                                      <w:sz w:val="18"/>
-                                      <w:szCs w:val="18"/>
-                                    </w:rPr>
-                                    <w:t>muestra los taxis filtrados por barrio.</w:t>
+                                      <w:rFonts w:eastAsia="Calibri" w:cs="" w:ascii="Arial" w:hAnsi="Arial"/>
+                                      <w:kern w:val="0"/>
+                                      <w:sz w:val="18"/>
+                                      <w:szCs w:val="18"/>
+                                      <w:lang w:val="es-ES" w:eastAsia="es-ES" w:bidi="ar-SA"/>
+                                    </w:rPr>
+                                    <w:t>5. El sistema muestra los taxis filtrados por barrio.</w:t>
                                   </w:r>
                                 </w:p>
                               </w:tc>
@@ -1591,6 +1736,9 @@
                                 <w:p>
                                   <w:pPr>
                                     <w:pStyle w:val="Contenidodelatabla"/>
+                                    <w:widowControl/>
+                                    <w:suppressAutoHyphens w:val="true"/>
+                                    <w:spacing w:before="0" w:after="0"/>
                                     <w:ind w:hanging="0" w:left="0" w:right="0"/>
                                     <w:jc w:val="center"/>
                                     <w:rPr>
@@ -1601,9 +1749,11 @@
                                   </w:pPr>
                                   <w:r>
                                     <w:rPr>
-                                      <w:rFonts w:ascii="Arial" w:hAnsi="Arial"/>
-                                      <w:sz w:val="18"/>
-                                      <w:szCs w:val="18"/>
+                                      <w:rFonts w:eastAsia="Calibri" w:cs="" w:ascii="Arial" w:hAnsi="Arial"/>
+                                      <w:kern w:val="0"/>
+                                      <w:sz w:val="18"/>
+                                      <w:szCs w:val="18"/>
+                                      <w:lang w:val="es-ES" w:eastAsia="es-ES" w:bidi="ar-SA"/>
                                     </w:rPr>
                                     <w:t>El sistema muestra sólo los taxis que se encuentren dentro del barrio ingresado como filtro por el Administrador de la Central.</w:t>
                                   </w:r>
@@ -1611,9 +1761,18 @@
                               </w:tc>
                             </w:tr>
                           </w:tbl>
+                          <w:p>
+                            <w:pPr>
+                              <w:pStyle w:val="Contenidodelmarco"/>
+                              <w:rPr/>
+                            </w:pPr>
+                            <w:r>
+                              <w:rPr/>
+                            </w:r>
+                          </w:p>
                         </w:txbxContent>
                       </wps:txbx>
-                      <wps:bodyPr anchor="t" lIns="0" tIns="0" rIns="0" bIns="0">
+                      <wps:bodyPr lIns="0" rIns="0" tIns="0" bIns="0" anchor="t">
                         <a:spAutoFit/>
                       </wps:bodyPr>
                     </wps:wsp>
@@ -1624,8 +1783,10 @@
           </mc:Choice>
           <mc:Fallback>
             <w:pict>
-              <v:rect style="position:absolute;rotation:-0;width:808.05pt;height:529.8pt;mso-wrap-distance-left:9pt;mso-wrap-distance-right:9pt;mso-wrap-distance-top:0pt;mso-wrap-distance-bottom:0pt;margin-top:-59.6pt;mso-position-vertical-relative:text;margin-left:-53.9pt;mso-position-horizontal:center;mso-position-horizontal-relative:margin">
-                <v:textbox inset="0in,0in,0in,0in">
+              <v:rect id="shape_0" ID="Marco1" path="m0,0l-2147483645,0l-2147483645,-2147483646l0,-2147483646xe" fillcolor="white" stroked="f" o:allowincell="f" style="position:absolute;margin-left:-53.95pt;margin-top:-59.6pt;width:808pt;height:541.85pt;mso-wrap-style:square;v-text-anchor:top;mso-position-horizontal:center;mso-position-horizontal-relative:margin">
+                <v:fill o:detectmouseclick="t" type="solid" color2="black" opacity="0"/>
+                <v:stroke color="#3465a4" joinstyle="round" endcap="flat"/>
+                <v:textbox>
                   <w:txbxContent>
                     <w:p>
                       <w:pPr>
@@ -1692,6 +1853,7 @@
                             <w:pPr>
                               <w:pStyle w:val="Normal"/>
                               <w:widowControl/>
+                              <w:suppressAutoHyphens w:val="true"/>
                               <w:spacing w:before="0" w:after="0"/>
                               <w:jc w:val="center"/>
                               <w:rPr>
@@ -1728,6 +1890,7 @@
                             <w:pPr>
                               <w:pStyle w:val="Normal"/>
                               <w:widowControl/>
+                              <w:suppressAutoHyphens w:val="true"/>
                               <w:spacing w:before="0" w:after="0"/>
                               <w:jc w:val="center"/>
                               <w:cnfStyle w:val="100000000000" w:firstRow="1" w:lastRow="0" w:firstColumn="0" w:lastColumn="0" w:oddVBand="0" w:evenVBand="0" w:oddHBand="0" w:evenHBand="0" w:firstRowFirstColumn="0" w:firstRowLastColumn="0" w:lastRowFirstColumn="0" w:lastRowLastColumn="0"/>
@@ -1765,6 +1928,7 @@
                             <w:pPr>
                               <w:pStyle w:val="Normal"/>
                               <w:widowControl/>
+                              <w:suppressAutoHyphens w:val="true"/>
                               <w:spacing w:before="0" w:after="0"/>
                               <w:jc w:val="center"/>
                               <w:cnfStyle w:val="100000000000" w:firstRow="1" w:lastRow="0" w:firstColumn="0" w:lastColumn="0" w:oddVBand="0" w:evenVBand="0" w:oddHBand="0" w:evenHBand="0" w:firstRowFirstColumn="0" w:firstRowLastColumn="0" w:lastRowFirstColumn="0" w:lastRowLastColumn="0"/>
@@ -1802,6 +1966,7 @@
                             <w:pPr>
                               <w:pStyle w:val="Normal"/>
                               <w:widowControl/>
+                              <w:suppressAutoHyphens w:val="true"/>
                               <w:spacing w:before="0" w:after="0"/>
                               <w:jc w:val="center"/>
                               <w:cnfStyle w:val="100000000000" w:firstRow="1" w:lastRow="0" w:firstColumn="0" w:lastColumn="0" w:oddVBand="0" w:evenVBand="0" w:oddHBand="0" w:evenHBand="0" w:firstRowFirstColumn="0" w:firstRowLastColumn="0" w:lastRowFirstColumn="0" w:lastRowLastColumn="0"/>
@@ -1839,6 +2004,7 @@
                             <w:pPr>
                               <w:pStyle w:val="Normal"/>
                               <w:widowControl/>
+                              <w:suppressAutoHyphens w:val="true"/>
                               <w:spacing w:before="0" w:after="0"/>
                               <w:jc w:val="center"/>
                               <w:cnfStyle w:val="100000000000" w:firstRow="1" w:lastRow="0" w:firstColumn="0" w:lastColumn="0" w:oddVBand="0" w:evenVBand="0" w:oddHBand="0" w:evenHBand="0" w:firstRowFirstColumn="0" w:firstRowLastColumn="0" w:lastRowFirstColumn="0" w:lastRowLastColumn="0"/>
@@ -1876,6 +2042,7 @@
                             <w:pPr>
                               <w:pStyle w:val="Normal"/>
                               <w:widowControl/>
+                              <w:suppressAutoHyphens w:val="true"/>
                               <w:spacing w:before="0" w:after="0"/>
                               <w:jc w:val="center"/>
                               <w:cnfStyle w:val="100000000000" w:firstRow="1" w:lastRow="0" w:firstColumn="0" w:lastColumn="0" w:oddVBand="0" w:evenVBand="0" w:oddHBand="0" w:evenHBand="0" w:firstRowFirstColumn="0" w:firstRowLastColumn="0" w:lastRowFirstColumn="0" w:lastRowLastColumn="0"/>
@@ -1920,6 +2087,7 @@
                             <w:pPr>
                               <w:pStyle w:val="Normal"/>
                               <w:widowControl/>
+                              <w:suppressAutoHyphens w:val="true"/>
                               <w:spacing w:before="0" w:after="0"/>
                               <w:jc w:val="center"/>
                               <w:rPr>
@@ -1962,6 +2130,7 @@
                             <w:pPr>
                               <w:pStyle w:val="Normal"/>
                               <w:widowControl/>
+                              <w:suppressAutoHyphens w:val="true"/>
                               <w:spacing w:before="0" w:after="0"/>
                               <w:jc w:val="center"/>
                               <w:cnfStyle w:val="000000100000" w:firstRow="0" w:lastRow="0" w:firstColumn="0" w:lastColumn="0" w:oddVBand="0" w:evenVBand="0" w:oddHBand="1" w:evenHBand="0" w:firstRowFirstColumn="0" w:firstRowLastColumn="0" w:lastRowFirstColumn="0" w:lastRowLastColumn="0"/>
@@ -2000,6 +2169,7 @@
                           <w:p>
                             <w:pPr>
                               <w:pStyle w:val="Normal"/>
+                              <w:suppressAutoHyphens w:val="true"/>
                               <w:bidi w:val="0"/>
                               <w:jc w:val="center"/>
                               <w:rPr>
@@ -2029,6 +2199,7 @@
                             <w:pPr>
                               <w:pStyle w:val="Normal"/>
                               <w:widowControl/>
+                              <w:suppressAutoHyphens w:val="true"/>
                               <w:spacing w:before="0" w:after="0"/>
                               <w:jc w:val="center"/>
                               <w:cnfStyle w:val="000000100000" w:firstRow="0" w:lastRow="0" w:firstColumn="0" w:lastColumn="0" w:oddVBand="0" w:evenVBand="0" w:oddHBand="1" w:evenHBand="0" w:firstRowFirstColumn="0" w:firstRowLastColumn="0" w:lastRowFirstColumn="0" w:lastRowLastColumn="0"/>
@@ -2066,6 +2237,9 @@
                           <w:p>
                             <w:pPr>
                               <w:pStyle w:val="Contenidodelatabla"/>
+                              <w:widowControl/>
+                              <w:suppressAutoHyphens w:val="true"/>
+                              <w:spacing w:before="0" w:after="0"/>
                               <w:ind w:hanging="0" w:left="0" w:right="0"/>
                               <w:jc w:val="center"/>
                               <w:rPr>
@@ -2076,9 +2250,11 @@
                             </w:pPr>
                             <w:r>
                               <w:rPr>
-                                <w:rFonts w:ascii="Arial" w:hAnsi="Arial"/>
-                                <w:sz w:val="18"/>
-                                <w:szCs w:val="18"/>
+                                <w:rFonts w:eastAsia="Calibri" w:cs="" w:ascii="Arial" w:hAnsi="Arial"/>
+                                <w:kern w:val="0"/>
+                                <w:sz w:val="18"/>
+                                <w:szCs w:val="18"/>
+                                <w:lang w:val="es-ES" w:eastAsia="es-ES" w:bidi="ar-SA"/>
                               </w:rPr>
                               <w:t>El Administrador de la Central debe estar logueado en el sistema.</w:t>
                             </w:r>
@@ -2086,6 +2262,9 @@
                           <w:p>
                             <w:pPr>
                               <w:pStyle w:val="Contenidodelatabla"/>
+                              <w:widowControl/>
+                              <w:suppressAutoHyphens w:val="true"/>
+                              <w:spacing w:before="0" w:after="0"/>
                               <w:ind w:hanging="0" w:left="0" w:right="0"/>
                               <w:jc w:val="center"/>
                               <w:rPr>
@@ -2096,15 +2275,20 @@
                             </w:pPr>
                             <w:r>
                               <w:rPr>
-                                <w:rFonts w:ascii="Arial" w:hAnsi="Arial"/>
-                                <w:sz w:val="18"/>
-                                <w:szCs w:val="18"/>
+                                <w:rFonts w:eastAsia="Calibri" w:cs="" w:ascii="Arial" w:hAnsi="Arial"/>
+                                <w:kern w:val="0"/>
+                                <w:sz w:val="18"/>
+                                <w:szCs w:val="18"/>
+                                <w:lang w:val="es-ES" w:eastAsia="es-ES" w:bidi="ar-SA"/>
                               </w:rPr>
                             </w:r>
                           </w:p>
                           <w:p>
                             <w:pPr>
                               <w:pStyle w:val="Contenidodelatabla"/>
+                              <w:widowControl/>
+                              <w:suppressAutoHyphens w:val="true"/>
+                              <w:spacing w:before="0" w:after="0"/>
                               <w:ind w:hanging="0" w:left="0" w:right="0"/>
                               <w:jc w:val="center"/>
                               <w:rPr>
@@ -2115,9 +2299,11 @@
                             </w:pPr>
                             <w:r>
                               <w:rPr>
-                                <w:rFonts w:ascii="Arial" w:hAnsi="Arial"/>
-                                <w:sz w:val="18"/>
-                                <w:szCs w:val="18"/>
+                                <w:rFonts w:eastAsia="Calibri" w:cs="" w:ascii="Arial" w:hAnsi="Arial"/>
+                                <w:kern w:val="0"/>
+                                <w:sz w:val="18"/>
+                                <w:szCs w:val="18"/>
+                                <w:lang w:val="es-ES" w:eastAsia="es-ES" w:bidi="ar-SA"/>
                               </w:rPr>
                               <w:t>Los taxis deben estar registrados en alguna central con el servicio taxi mobile.</w:t>
                             </w:r>
@@ -2125,6 +2311,9 @@
                           <w:p>
                             <w:pPr>
                               <w:pStyle w:val="Contenidodelatabla"/>
+                              <w:widowControl/>
+                              <w:suppressAutoHyphens w:val="true"/>
+                              <w:spacing w:before="0" w:after="0"/>
                               <w:ind w:hanging="0" w:left="0" w:right="0"/>
                               <w:jc w:val="center"/>
                               <w:rPr>
@@ -2135,15 +2324,20 @@
                             </w:pPr>
                             <w:r>
                               <w:rPr>
-                                <w:rFonts w:ascii="Arial" w:hAnsi="Arial"/>
-                                <w:sz w:val="18"/>
-                                <w:szCs w:val="18"/>
+                                <w:rFonts w:eastAsia="Calibri" w:cs="" w:ascii="Arial" w:hAnsi="Arial"/>
+                                <w:kern w:val="0"/>
+                                <w:sz w:val="18"/>
+                                <w:szCs w:val="18"/>
+                                <w:lang w:val="es-ES" w:eastAsia="es-ES" w:bidi="ar-SA"/>
                               </w:rPr>
                             </w:r>
                           </w:p>
                           <w:p>
                             <w:pPr>
                               <w:pStyle w:val="Contenidodelatabla"/>
+                              <w:widowControl/>
+                              <w:suppressAutoHyphens w:val="true"/>
+                              <w:spacing w:before="0" w:after="0"/>
                               <w:ind w:hanging="0" w:left="0" w:right="0"/>
                               <w:jc w:val="center"/>
                               <w:rPr>
@@ -2154,9 +2348,11 @@
                             </w:pPr>
                             <w:r>
                               <w:rPr>
-                                <w:rFonts w:ascii="Arial" w:hAnsi="Arial"/>
-                                <w:sz w:val="18"/>
-                                <w:szCs w:val="18"/>
+                                <w:rFonts w:eastAsia="Calibri" w:cs="" w:ascii="Arial" w:hAnsi="Arial"/>
+                                <w:kern w:val="0"/>
+                                <w:sz w:val="18"/>
+                                <w:szCs w:val="18"/>
+                                <w:lang w:val="es-ES" w:eastAsia="es-ES" w:bidi="ar-SA"/>
                               </w:rPr>
                               <w:t>Los taxis deben estar registrados en la aplicación.</w:t>
                             </w:r>
@@ -2164,6 +2360,9 @@
                           <w:p>
                             <w:pPr>
                               <w:pStyle w:val="Contenidodelatabla"/>
+                              <w:widowControl/>
+                              <w:suppressAutoHyphens w:val="true"/>
+                              <w:spacing w:before="0" w:after="0"/>
                               <w:ind w:hanging="0" w:left="0" w:right="0"/>
                               <w:jc w:val="center"/>
                               <w:rPr>
@@ -2174,15 +2373,20 @@
                             </w:pPr>
                             <w:r>
                               <w:rPr>
-                                <w:rFonts w:ascii="Arial" w:hAnsi="Arial"/>
-                                <w:sz w:val="18"/>
-                                <w:szCs w:val="18"/>
+                                <w:rFonts w:eastAsia="Calibri" w:cs="" w:ascii="Arial" w:hAnsi="Arial"/>
+                                <w:kern w:val="0"/>
+                                <w:sz w:val="18"/>
+                                <w:szCs w:val="18"/>
+                                <w:lang w:val="es-ES" w:eastAsia="es-ES" w:bidi="ar-SA"/>
                               </w:rPr>
                             </w:r>
                           </w:p>
                           <w:p>
                             <w:pPr>
                               <w:pStyle w:val="Contenidodelatabla"/>
+                              <w:widowControl/>
+                              <w:suppressAutoHyphens w:val="true"/>
+                              <w:spacing w:before="0" w:after="0"/>
                               <w:ind w:hanging="0" w:left="0" w:right="0"/>
                               <w:jc w:val="center"/>
                               <w:rPr>
@@ -2193,9 +2397,11 @@
                             </w:pPr>
                             <w:r>
                               <w:rPr>
-                                <w:rFonts w:ascii="Arial" w:hAnsi="Arial"/>
-                                <w:sz w:val="18"/>
-                                <w:szCs w:val="18"/>
+                                <w:rFonts w:eastAsia="Calibri" w:cs="" w:ascii="Arial" w:hAnsi="Arial"/>
+                                <w:kern w:val="0"/>
+                                <w:sz w:val="18"/>
+                                <w:szCs w:val="18"/>
+                                <w:lang w:val="es-ES" w:eastAsia="es-ES" w:bidi="ar-SA"/>
                               </w:rPr>
                               <w:t>Los taxis deben tener habilitada la localización por GPS.</w:t>
                             </w:r>
@@ -2216,6 +2422,9 @@
                           <w:p>
                             <w:pPr>
                               <w:pStyle w:val="Contenidodelatabla"/>
+                              <w:widowControl/>
+                              <w:suppressAutoHyphens w:val="true"/>
+                              <w:spacing w:before="0" w:after="0"/>
                               <w:ind w:hanging="0" w:left="0" w:right="0"/>
                               <w:jc w:val="center"/>
                               <w:rPr>
@@ -2226,9 +2435,11 @@
                             </w:pPr>
                             <w:r>
                               <w:rPr>
-                                <w:rFonts w:ascii="Arial" w:hAnsi="Arial"/>
-                                <w:sz w:val="18"/>
-                                <w:szCs w:val="18"/>
+                                <w:rFonts w:eastAsia="Calibri" w:cs="" w:ascii="Arial" w:hAnsi="Arial"/>
+                                <w:kern w:val="0"/>
+                                <w:sz w:val="18"/>
+                                <w:szCs w:val="18"/>
+                                <w:lang w:val="es-ES" w:eastAsia="es-ES" w:bidi="ar-SA"/>
                               </w:rPr>
                               <w:t>1. El Administrador de la Central selecciona la opción “Visualizar Mapa”</w:t>
                               <w:br/>
@@ -2252,6 +2463,9 @@
                           <w:p>
                             <w:pPr>
                               <w:pStyle w:val="Contenidodelatabla"/>
+                              <w:widowControl/>
+                              <w:suppressAutoHyphens w:val="true"/>
+                              <w:spacing w:before="0" w:after="0"/>
                               <w:ind w:hanging="0" w:left="0" w:right="0"/>
                               <w:jc w:val="center"/>
                               <w:rPr>
@@ -2262,11 +2476,13 @@
                             </w:pPr>
                             <w:r>
                               <w:rPr>
-                                <w:rFonts w:ascii="Arial" w:hAnsi="Arial"/>
-                                <w:sz w:val="18"/>
-                                <w:szCs w:val="18"/>
-                              </w:rPr>
-                              <w:t xml:space="preserve">El sistema muestra el mapa con distintos colores los taxis: ocupados, los libres, los solicitados y los que están fuera de servicio. </w:t>
+                                <w:rFonts w:eastAsia="Calibri" w:cs="" w:ascii="Arial" w:hAnsi="Arial"/>
+                                <w:kern w:val="0"/>
+                                <w:sz w:val="18"/>
+                                <w:szCs w:val="18"/>
+                                <w:lang w:val="es-ES" w:eastAsia="es-ES" w:bidi="ar-SA"/>
+                              </w:rPr>
+                              <w:t>El sistema muestra el mapa con distintos colores los taxis: ocupados, los libres, los solicitados y los que están fuera de servicio.</w:t>
                             </w:r>
                           </w:p>
                         </w:tc>
@@ -2293,6 +2509,7 @@
                             <w:pPr>
                               <w:pStyle w:val="Normal"/>
                               <w:widowControl/>
+                              <w:suppressAutoHyphens w:val="true"/>
                               <w:spacing w:before="0" w:after="0"/>
                               <w:jc w:val="center"/>
                               <w:rPr>
@@ -2335,6 +2552,7 @@
                             <w:pPr>
                               <w:pStyle w:val="Normal"/>
                               <w:widowControl/>
+                              <w:suppressAutoHyphens w:val="true"/>
                               <w:spacing w:before="0" w:after="0"/>
                               <w:jc w:val="center"/>
                               <w:cnfStyle w:val="000000100000" w:firstRow="0" w:lastRow="0" w:firstColumn="0" w:lastColumn="0" w:oddVBand="0" w:evenVBand="0" w:oddHBand="1" w:evenHBand="0" w:firstRowFirstColumn="0" w:firstRowLastColumn="0" w:lastRowFirstColumn="0" w:lastRowLastColumn="0"/>
@@ -2354,7 +2572,7 @@
                                 <w:szCs w:val="18"/>
                                 <w:lang w:bidi="ar-SA"/>
                               </w:rPr>
-                              <w:t>MEDIA</w:t>
+                              <w:t>ALTA</w:t>
                             </w:r>
                           </w:p>
                         </w:tc>
@@ -2373,6 +2591,7 @@
                           <w:p>
                             <w:pPr>
                               <w:pStyle w:val="Normal"/>
+                              <w:suppressAutoHyphens w:val="true"/>
                               <w:bidi w:val="0"/>
                               <w:jc w:val="center"/>
                               <w:rPr>
@@ -2406,6 +2625,9 @@
                           <w:p>
                             <w:pPr>
                               <w:pStyle w:val="Contenidodelatabla"/>
+                              <w:widowControl/>
+                              <w:suppressAutoHyphens w:val="true"/>
+                              <w:spacing w:before="0" w:after="0"/>
                               <w:ind w:hanging="0" w:left="0" w:right="0"/>
                               <w:jc w:val="center"/>
                               <w:rPr>
@@ -2416,9 +2638,11 @@
                             </w:pPr>
                             <w:r>
                               <w:rPr>
-                                <w:rFonts w:ascii="Arial" w:hAnsi="Arial"/>
-                                <w:sz w:val="18"/>
-                                <w:szCs w:val="18"/>
+                                <w:rFonts w:eastAsia="Calibri" w:cs="" w:ascii="Arial" w:hAnsi="Arial"/>
+                                <w:kern w:val="0"/>
+                                <w:sz w:val="18"/>
+                                <w:szCs w:val="18"/>
+                                <w:lang w:val="es-ES" w:eastAsia="es-ES" w:bidi="ar-SA"/>
                               </w:rPr>
                               <w:t>El taxi esta en estado solicitado y tiene asociado un pasajero</w:t>
                             </w:r>
@@ -2439,6 +2663,9 @@
                           <w:p>
                             <w:pPr>
                               <w:pStyle w:val="Contenidodelatabla"/>
+                              <w:widowControl/>
+                              <w:suppressAutoHyphens w:val="true"/>
+                              <w:spacing w:before="0" w:after="0"/>
                               <w:ind w:hanging="0" w:left="0" w:right="0"/>
                               <w:jc w:val="center"/>
                               <w:rPr>
@@ -2449,9 +2676,11 @@
                             </w:pPr>
                             <w:r>
                               <w:rPr>
-                                <w:rFonts w:ascii="Arial" w:hAnsi="Arial"/>
-                                <w:sz w:val="18"/>
-                                <w:szCs w:val="18"/>
+                                <w:rFonts w:eastAsia="Calibri" w:cs="" w:ascii="Arial" w:hAnsi="Arial"/>
+                                <w:kern w:val="0"/>
+                                <w:sz w:val="18"/>
+                                <w:szCs w:val="18"/>
+                                <w:lang w:val="es-ES" w:eastAsia="es-ES" w:bidi="ar-SA"/>
                               </w:rPr>
                               <w:t>1. El administrador de la Central selecciona la opción “Visualizar Mapa”</w:t>
                             </w:r>
@@ -2459,6 +2688,9 @@
                           <w:p>
                             <w:pPr>
                               <w:pStyle w:val="Contenidodelatabla"/>
+                              <w:widowControl/>
+                              <w:suppressAutoHyphens w:val="true"/>
+                              <w:spacing w:before="0" w:after="0"/>
                               <w:ind w:hanging="0" w:left="0" w:right="0"/>
                               <w:jc w:val="center"/>
                               <w:rPr>
@@ -2469,15 +2701,20 @@
                             </w:pPr>
                             <w:r>
                               <w:rPr>
-                                <w:rFonts w:ascii="Arial" w:hAnsi="Arial"/>
-                                <w:sz w:val="18"/>
-                                <w:szCs w:val="18"/>
+                                <w:rFonts w:eastAsia="Calibri" w:cs="" w:ascii="Arial" w:hAnsi="Arial"/>
+                                <w:kern w:val="0"/>
+                                <w:sz w:val="18"/>
+                                <w:szCs w:val="18"/>
+                                <w:lang w:val="es-ES" w:eastAsia="es-ES" w:bidi="ar-SA"/>
                               </w:rPr>
                             </w:r>
                           </w:p>
                           <w:p>
                             <w:pPr>
                               <w:pStyle w:val="Contenidodelatabla"/>
+                              <w:widowControl/>
+                              <w:suppressAutoHyphens w:val="true"/>
+                              <w:spacing w:before="0" w:after="0"/>
                               <w:ind w:hanging="0" w:left="0" w:right="0"/>
                               <w:jc w:val="center"/>
                               <w:rPr>
@@ -2488,11 +2725,13 @@
                             </w:pPr>
                             <w:r>
                               <w:rPr>
-                                <w:rFonts w:ascii="Arial" w:hAnsi="Arial"/>
-                                <w:sz w:val="18"/>
-                                <w:szCs w:val="18"/>
-                              </w:rPr>
-                              <w:t xml:space="preserve">2. El Administrador de la Central pasa el mouse por encima del taxi </w:t>
+                                <w:rFonts w:eastAsia="Calibri" w:cs="" w:ascii="Arial" w:hAnsi="Arial"/>
+                                <w:kern w:val="0"/>
+                                <w:sz w:val="18"/>
+                                <w:szCs w:val="18"/>
+                                <w:lang w:val="es-ES" w:eastAsia="es-ES" w:bidi="ar-SA"/>
+                              </w:rPr>
+                              <w:t>2. El Administrador de la Central pasa el mouse por encima del taxi</w:t>
                             </w:r>
                           </w:p>
                         </w:tc>
@@ -2511,6 +2750,9 @@
                           <w:p>
                             <w:pPr>
                               <w:pStyle w:val="Contenidodelatabla"/>
+                              <w:widowControl/>
+                              <w:suppressAutoHyphens w:val="true"/>
+                              <w:spacing w:before="0" w:after="0"/>
                               <w:ind w:hanging="0" w:left="0" w:right="0"/>
                               <w:jc w:val="center"/>
                               <w:rPr>
@@ -2521,9 +2763,11 @@
                             </w:pPr>
                             <w:r>
                               <w:rPr>
-                                <w:rFonts w:ascii="Arial" w:hAnsi="Arial"/>
-                                <w:sz w:val="18"/>
-                                <w:szCs w:val="18"/>
+                                <w:rFonts w:eastAsia="Calibri" w:cs="" w:ascii="Arial" w:hAnsi="Arial"/>
+                                <w:kern w:val="0"/>
+                                <w:sz w:val="18"/>
+                                <w:szCs w:val="18"/>
+                                <w:lang w:val="es-ES" w:eastAsia="es-ES" w:bidi="ar-SA"/>
                               </w:rPr>
                               <w:t>El sistema muestra los datos del pasajero (nombre, apellido y teléfono), sin mostrar la información del viaje.</w:t>
                             </w:r>
@@ -2552,6 +2796,7 @@
                             <w:pPr>
                               <w:pStyle w:val="Normal"/>
                               <w:widowControl/>
+                              <w:suppressAutoHyphens w:val="true"/>
                               <w:spacing w:before="0" w:after="0"/>
                               <w:jc w:val="center"/>
                               <w:rPr>
@@ -2594,6 +2839,7 @@
                             <w:pPr>
                               <w:pStyle w:val="Normal"/>
                               <w:widowControl/>
+                              <w:suppressAutoHyphens w:val="true"/>
                               <w:spacing w:before="0" w:after="0"/>
                               <w:jc w:val="center"/>
                               <w:cnfStyle w:val="000000100000" w:firstRow="0" w:lastRow="0" w:firstColumn="0" w:lastColumn="0" w:oddVBand="0" w:evenVBand="0" w:oddHBand="1" w:evenHBand="0" w:firstRowFirstColumn="0" w:firstRowLastColumn="0" w:lastRowFirstColumn="0" w:lastRowLastColumn="0"/>
@@ -2613,7 +2859,7 @@
                                 <w:szCs w:val="18"/>
                                 <w:lang w:bidi="ar-SA"/>
                               </w:rPr>
-                              <w:t>MEDIA</w:t>
+                              <w:t>ALTA</w:t>
                             </w:r>
                           </w:p>
                         </w:tc>
@@ -2632,6 +2878,7 @@
                           <w:p>
                             <w:pPr>
                               <w:pStyle w:val="Normal"/>
+                              <w:suppressAutoHyphens w:val="true"/>
                               <w:bidi w:val="0"/>
                               <w:jc w:val="center"/>
                               <w:rPr>
@@ -2665,6 +2912,9 @@
                           <w:p>
                             <w:pPr>
                               <w:pStyle w:val="Contenidodelatabla"/>
+                              <w:widowControl/>
+                              <w:suppressAutoHyphens w:val="true"/>
+                              <w:spacing w:before="0" w:after="0"/>
                               <w:ind w:hanging="0" w:left="0" w:right="0"/>
                               <w:jc w:val="center"/>
                               <w:rPr>
@@ -2675,9 +2925,11 @@
                             </w:pPr>
                             <w:r>
                               <w:rPr>
-                                <w:rFonts w:ascii="Arial" w:hAnsi="Arial"/>
-                                <w:sz w:val="18"/>
-                                <w:szCs w:val="18"/>
+                                <w:rFonts w:eastAsia="Calibri" w:cs="" w:ascii="Arial" w:hAnsi="Arial"/>
+                                <w:kern w:val="0"/>
+                                <w:sz w:val="18"/>
+                                <w:szCs w:val="18"/>
+                                <w:lang w:val="es-ES" w:eastAsia="es-ES" w:bidi="ar-SA"/>
                               </w:rPr>
                               <w:t>El taxi esta en estado ocupado, tiene un pasajero y un recorrido asociado</w:t>
                             </w:r>
@@ -2698,6 +2950,9 @@
                           <w:p>
                             <w:pPr>
                               <w:pStyle w:val="Contenidodelatabla"/>
+                              <w:widowControl/>
+                              <w:suppressAutoHyphens w:val="true"/>
+                              <w:spacing w:before="0" w:after="0"/>
                               <w:ind w:hanging="0" w:left="0" w:right="0"/>
                               <w:jc w:val="center"/>
                               <w:rPr>
@@ -2708,9 +2963,11 @@
                             </w:pPr>
                             <w:r>
                               <w:rPr>
-                                <w:rFonts w:ascii="Arial" w:hAnsi="Arial"/>
-                                <w:sz w:val="18"/>
-                                <w:szCs w:val="18"/>
+                                <w:rFonts w:eastAsia="Calibri" w:cs="" w:ascii="Arial" w:hAnsi="Arial"/>
+                                <w:kern w:val="0"/>
+                                <w:sz w:val="18"/>
+                                <w:szCs w:val="18"/>
+                                <w:lang w:val="es-ES" w:eastAsia="es-ES" w:bidi="ar-SA"/>
                               </w:rPr>
                               <w:t>1. El Administrador de la Central selecciona la opción “Visualizar Mapa”</w:t>
                             </w:r>
@@ -2718,6 +2975,9 @@
                           <w:p>
                             <w:pPr>
                               <w:pStyle w:val="Contenidodelatabla"/>
+                              <w:widowControl/>
+                              <w:suppressAutoHyphens w:val="true"/>
+                              <w:spacing w:before="0" w:after="0"/>
                               <w:ind w:hanging="0" w:left="0" w:right="0"/>
                               <w:jc w:val="center"/>
                               <w:rPr>
@@ -2728,15 +2988,20 @@
                             </w:pPr>
                             <w:r>
                               <w:rPr>
-                                <w:rFonts w:ascii="Arial" w:hAnsi="Arial"/>
-                                <w:sz w:val="18"/>
-                                <w:szCs w:val="18"/>
+                                <w:rFonts w:eastAsia="Calibri" w:cs="" w:ascii="Arial" w:hAnsi="Arial"/>
+                                <w:kern w:val="0"/>
+                                <w:sz w:val="18"/>
+                                <w:szCs w:val="18"/>
+                                <w:lang w:val="es-ES" w:eastAsia="es-ES" w:bidi="ar-SA"/>
                               </w:rPr>
                             </w:r>
                           </w:p>
                           <w:p>
                             <w:pPr>
                               <w:pStyle w:val="Contenidodelatabla"/>
+                              <w:widowControl/>
+                              <w:suppressAutoHyphens w:val="true"/>
+                              <w:spacing w:before="0" w:after="0"/>
                               <w:ind w:hanging="0" w:left="0" w:right="0"/>
                               <w:jc w:val="center"/>
                               <w:rPr>
@@ -2747,11 +3012,13 @@
                             </w:pPr>
                             <w:r>
                               <w:rPr>
-                                <w:rFonts w:ascii="Arial" w:hAnsi="Arial"/>
-                                <w:sz w:val="18"/>
-                                <w:szCs w:val="18"/>
-                              </w:rPr>
-                              <w:t xml:space="preserve">2. El Administrador de la Central pasa el mouse por encima del taxi </w:t>
+                                <w:rFonts w:eastAsia="Calibri" w:cs="" w:ascii="Arial" w:hAnsi="Arial"/>
+                                <w:kern w:val="0"/>
+                                <w:sz w:val="18"/>
+                                <w:szCs w:val="18"/>
+                                <w:lang w:val="es-ES" w:eastAsia="es-ES" w:bidi="ar-SA"/>
+                              </w:rPr>
+                              <w:t>2. El Administrador de la Central pasa el mouse por encima del taxi</w:t>
                             </w:r>
                           </w:p>
                         </w:tc>
@@ -2770,6 +3037,9 @@
                           <w:p>
                             <w:pPr>
                               <w:pStyle w:val="Contenidodelatabla"/>
+                              <w:widowControl/>
+                              <w:suppressAutoHyphens w:val="true"/>
+                              <w:spacing w:before="0" w:after="0"/>
                               <w:ind w:hanging="0" w:left="0" w:right="0"/>
                               <w:jc w:val="center"/>
                               <w:rPr>
@@ -2780,9 +3050,11 @@
                             </w:pPr>
                             <w:r>
                               <w:rPr>
-                                <w:rFonts w:ascii="Arial" w:hAnsi="Arial"/>
-                                <w:sz w:val="18"/>
-                                <w:szCs w:val="18"/>
+                                <w:rFonts w:eastAsia="Calibri" w:cs="" w:ascii="Arial" w:hAnsi="Arial"/>
+                                <w:kern w:val="0"/>
+                                <w:sz w:val="18"/>
+                                <w:szCs w:val="18"/>
+                                <w:lang w:val="es-ES" w:eastAsia="es-ES" w:bidi="ar-SA"/>
                               </w:rPr>
                               <w:t>El sistema muestra los datos del pasajero (nombre, apellido y teléfono) y muestra la información del recorrido (hora de inicio y costo).</w:t>
                             </w:r>
@@ -2811,6 +3083,7 @@
                             <w:pPr>
                               <w:pStyle w:val="Normal"/>
                               <w:widowControl/>
+                              <w:suppressAutoHyphens w:val="true"/>
                               <w:spacing w:before="0" w:after="0"/>
                               <w:jc w:val="center"/>
                               <w:rPr>
@@ -2853,6 +3126,7 @@
                             <w:pPr>
                               <w:pStyle w:val="Normal"/>
                               <w:widowControl/>
+                              <w:suppressAutoHyphens w:val="true"/>
                               <w:spacing w:before="0" w:after="0"/>
                               <w:jc w:val="center"/>
                               <w:cnfStyle w:val="000000100000" w:firstRow="0" w:lastRow="0" w:firstColumn="0" w:lastColumn="0" w:oddVBand="0" w:evenVBand="0" w:oddHBand="1" w:evenHBand="0" w:firstRowFirstColumn="0" w:firstRowLastColumn="0" w:lastRowFirstColumn="0" w:lastRowLastColumn="0"/>
@@ -2891,6 +3165,7 @@
                           <w:p>
                             <w:pPr>
                               <w:pStyle w:val="Normal"/>
+                              <w:suppressAutoHyphens w:val="true"/>
                               <w:bidi w:val="0"/>
                               <w:jc w:val="center"/>
                               <w:rPr>
@@ -2905,23 +3180,7 @@
                                 <w:sz w:val="18"/>
                                 <w:szCs w:val="18"/>
                               </w:rPr>
-                              <w:t xml:space="preserve">Filtrar </w:t>
-                            </w:r>
-                            <w:r>
-                              <w:rPr>
-                                <w:rFonts w:ascii="Arial" w:hAnsi="Arial"/>
-                                <w:sz w:val="18"/>
-                                <w:szCs w:val="18"/>
-                              </w:rPr>
-                              <w:t>taxis</w:t>
-                            </w:r>
-                            <w:r>
-                              <w:rPr>
-                                <w:rFonts w:ascii="Arial" w:hAnsi="Arial"/>
-                                <w:sz w:val="18"/>
-                                <w:szCs w:val="18"/>
-                              </w:rPr>
-                              <w:t xml:space="preserve"> por barrio existente </w:t>
+                              <w:t>Filtrar taxis por barrio existente</w:t>
                             </w:r>
                           </w:p>
                         </w:tc>
@@ -2940,6 +3199,9 @@
                           <w:p>
                             <w:pPr>
                               <w:pStyle w:val="Contenidodelatabla"/>
+                              <w:widowControl/>
+                              <w:suppressAutoHyphens w:val="true"/>
+                              <w:spacing w:before="0" w:after="0"/>
                               <w:ind w:hanging="0" w:left="0" w:right="0"/>
                               <w:jc w:val="center"/>
                               <w:rPr>
@@ -2950,9 +3212,11 @@
                             </w:pPr>
                             <w:r>
                               <w:rPr>
-                                <w:rFonts w:ascii="Arial" w:hAnsi="Arial"/>
-                                <w:sz w:val="18"/>
-                                <w:szCs w:val="18"/>
+                                <w:rFonts w:eastAsia="Calibri" w:cs="" w:ascii="Arial" w:hAnsi="Arial"/>
+                                <w:kern w:val="0"/>
+                                <w:sz w:val="18"/>
+                                <w:szCs w:val="18"/>
+                                <w:lang w:val="es-ES" w:eastAsia="es-ES" w:bidi="ar-SA"/>
                               </w:rPr>
                               <w:t>El barrio debe estar registrado en el sistema</w:t>
                             </w:r>
@@ -2973,6 +3237,9 @@
                           <w:p>
                             <w:pPr>
                               <w:pStyle w:val="Contenidodelatabla"/>
+                              <w:widowControl/>
+                              <w:suppressAutoHyphens w:val="true"/>
+                              <w:spacing w:before="0" w:after="0"/>
                               <w:ind w:hanging="0" w:left="0" w:right="0"/>
                               <w:jc w:val="center"/>
                               <w:rPr>
@@ -2983,9 +3250,11 @@
                             </w:pPr>
                             <w:r>
                               <w:rPr>
-                                <w:rFonts w:ascii="Arial" w:hAnsi="Arial"/>
-                                <w:sz w:val="18"/>
-                                <w:szCs w:val="18"/>
+                                <w:rFonts w:eastAsia="Calibri" w:cs="" w:ascii="Arial" w:hAnsi="Arial"/>
+                                <w:kern w:val="0"/>
+                                <w:sz w:val="18"/>
+                                <w:szCs w:val="18"/>
+                                <w:lang w:val="es-ES" w:eastAsia="es-ES" w:bidi="ar-SA"/>
                               </w:rPr>
                               <w:t>1. El Administrador de la Central selecciona la opción “Visualizar Mapa”</w:t>
                             </w:r>
@@ -2993,6 +3262,9 @@
                           <w:p>
                             <w:pPr>
                               <w:pStyle w:val="Contenidodelatabla"/>
+                              <w:widowControl/>
+                              <w:suppressAutoHyphens w:val="true"/>
+                              <w:spacing w:before="0" w:after="0"/>
                               <w:ind w:hanging="0" w:left="0" w:right="0"/>
                               <w:jc w:val="center"/>
                               <w:rPr>
@@ -3003,15 +3275,20 @@
                             </w:pPr>
                             <w:r>
                               <w:rPr>
-                                <w:rFonts w:ascii="Arial" w:hAnsi="Arial"/>
-                                <w:sz w:val="18"/>
-                                <w:szCs w:val="18"/>
+                                <w:rFonts w:eastAsia="Calibri" w:cs="" w:ascii="Arial" w:hAnsi="Arial"/>
+                                <w:kern w:val="0"/>
+                                <w:sz w:val="18"/>
+                                <w:szCs w:val="18"/>
+                                <w:lang w:val="es-ES" w:eastAsia="es-ES" w:bidi="ar-SA"/>
                               </w:rPr>
                             </w:r>
                           </w:p>
                           <w:p>
                             <w:pPr>
                               <w:pStyle w:val="Contenidodelatabla"/>
+                              <w:widowControl/>
+                              <w:suppressAutoHyphens w:val="true"/>
+                              <w:spacing w:before="0" w:after="0"/>
                               <w:ind w:hanging="0" w:left="0" w:right="0"/>
                               <w:jc w:val="center"/>
                               <w:rPr>
@@ -3022,9 +3299,11 @@
                             </w:pPr>
                             <w:r>
                               <w:rPr>
-                                <w:rFonts w:ascii="Arial" w:hAnsi="Arial"/>
-                                <w:sz w:val="18"/>
-                                <w:szCs w:val="18"/>
+                                <w:rFonts w:eastAsia="Calibri" w:cs="" w:ascii="Arial" w:hAnsi="Arial"/>
+                                <w:kern w:val="0"/>
+                                <w:sz w:val="18"/>
+                                <w:szCs w:val="18"/>
+                                <w:lang w:val="es-ES" w:eastAsia="es-ES" w:bidi="ar-SA"/>
                               </w:rPr>
                               <w:t>2. El sistema muestra la opción para filtrar la visualización por “Barrio”.</w:t>
                             </w:r>
@@ -3032,6 +3311,9 @@
                           <w:p>
                             <w:pPr>
                               <w:pStyle w:val="Contenidodelatabla"/>
+                              <w:widowControl/>
+                              <w:suppressAutoHyphens w:val="true"/>
+                              <w:spacing w:before="0" w:after="0"/>
                               <w:ind w:hanging="0" w:left="0" w:right="0"/>
                               <w:jc w:val="center"/>
                               <w:rPr>
@@ -3042,15 +3324,20 @@
                             </w:pPr>
                             <w:r>
                               <w:rPr>
-                                <w:rFonts w:ascii="Arial" w:hAnsi="Arial"/>
-                                <w:sz w:val="18"/>
-                                <w:szCs w:val="18"/>
+                                <w:rFonts w:eastAsia="Calibri" w:cs="" w:ascii="Arial" w:hAnsi="Arial"/>
+                                <w:kern w:val="0"/>
+                                <w:sz w:val="18"/>
+                                <w:szCs w:val="18"/>
+                                <w:lang w:val="es-ES" w:eastAsia="es-ES" w:bidi="ar-SA"/>
                               </w:rPr>
                             </w:r>
                           </w:p>
                           <w:p>
                             <w:pPr>
                               <w:pStyle w:val="Contenidodelatabla"/>
+                              <w:widowControl/>
+                              <w:suppressAutoHyphens w:val="true"/>
+                              <w:spacing w:before="0" w:after="0"/>
                               <w:ind w:hanging="0" w:left="0" w:right="0"/>
                               <w:jc w:val="center"/>
                               <w:rPr>
@@ -3061,9 +3348,11 @@
                             </w:pPr>
                             <w:r>
                               <w:rPr>
-                                <w:rFonts w:ascii="Arial" w:hAnsi="Arial"/>
-                                <w:sz w:val="18"/>
-                                <w:szCs w:val="18"/>
+                                <w:rFonts w:eastAsia="Calibri" w:cs="" w:ascii="Arial" w:hAnsi="Arial"/>
+                                <w:kern w:val="0"/>
+                                <w:sz w:val="18"/>
+                                <w:szCs w:val="18"/>
+                                <w:lang w:val="es-ES" w:eastAsia="es-ES" w:bidi="ar-SA"/>
                               </w:rPr>
                               <w:t>3. El sistema solicita ingresar el nombre del barrio.</w:t>
                             </w:r>
@@ -3071,6 +3360,9 @@
                           <w:p>
                             <w:pPr>
                               <w:pStyle w:val="Contenidodelatabla"/>
+                              <w:widowControl/>
+                              <w:suppressAutoHyphens w:val="true"/>
+                              <w:spacing w:before="0" w:after="0"/>
                               <w:ind w:hanging="0" w:left="0" w:right="0"/>
                               <w:jc w:val="center"/>
                               <w:rPr>
@@ -3081,15 +3373,20 @@
                             </w:pPr>
                             <w:r>
                               <w:rPr>
-                                <w:rFonts w:ascii="Arial" w:hAnsi="Arial"/>
-                                <w:sz w:val="18"/>
-                                <w:szCs w:val="18"/>
+                                <w:rFonts w:eastAsia="Calibri" w:cs="" w:ascii="Arial" w:hAnsi="Arial"/>
+                                <w:kern w:val="0"/>
+                                <w:sz w:val="18"/>
+                                <w:szCs w:val="18"/>
+                                <w:lang w:val="es-ES" w:eastAsia="es-ES" w:bidi="ar-SA"/>
                               </w:rPr>
                             </w:r>
                           </w:p>
                           <w:p>
                             <w:pPr>
                               <w:pStyle w:val="Contenidodelatabla"/>
+                              <w:widowControl/>
+                              <w:suppressAutoHyphens w:val="true"/>
+                              <w:spacing w:before="0" w:after="0"/>
                               <w:ind w:hanging="0" w:left="0" w:right="0"/>
                               <w:jc w:val="center"/>
                               <w:rPr>
@@ -3100,9 +3397,11 @@
                             </w:pPr>
                             <w:r>
                               <w:rPr>
-                                <w:rFonts w:ascii="Arial" w:hAnsi="Arial"/>
-                                <w:sz w:val="18"/>
-                                <w:szCs w:val="18"/>
+                                <w:rFonts w:eastAsia="Calibri" w:cs="" w:ascii="Arial" w:hAnsi="Arial"/>
+                                <w:kern w:val="0"/>
+                                <w:sz w:val="18"/>
+                                <w:szCs w:val="18"/>
+                                <w:lang w:val="es-ES" w:eastAsia="es-ES" w:bidi="ar-SA"/>
                               </w:rPr>
                               <w:t>4. El Administrador de la Central ingresa el nombre del barrio.</w:t>
                             </w:r>
@@ -3110,6 +3409,9 @@
                           <w:p>
                             <w:pPr>
                               <w:pStyle w:val="Contenidodelatabla"/>
+                              <w:widowControl/>
+                              <w:suppressAutoHyphens w:val="true"/>
+                              <w:spacing w:before="0" w:after="0"/>
                               <w:ind w:hanging="0" w:left="0" w:right="0"/>
                               <w:jc w:val="center"/>
                               <w:rPr>
@@ -3120,15 +3422,20 @@
                             </w:pPr>
                             <w:r>
                               <w:rPr>
-                                <w:rFonts w:ascii="Arial" w:hAnsi="Arial"/>
-                                <w:sz w:val="18"/>
-                                <w:szCs w:val="18"/>
+                                <w:rFonts w:eastAsia="Calibri" w:cs="" w:ascii="Arial" w:hAnsi="Arial"/>
+                                <w:kern w:val="0"/>
+                                <w:sz w:val="18"/>
+                                <w:szCs w:val="18"/>
+                                <w:lang w:val="es-ES" w:eastAsia="es-ES" w:bidi="ar-SA"/>
                               </w:rPr>
                             </w:r>
                           </w:p>
                           <w:p>
                             <w:pPr>
                               <w:pStyle w:val="Contenidodelatabla"/>
+                              <w:widowControl/>
+                              <w:suppressAutoHyphens w:val="true"/>
+                              <w:spacing w:before="0" w:after="0"/>
                               <w:ind w:hanging="0" w:left="0" w:right="0"/>
                               <w:jc w:val="center"/>
                               <w:rPr>
@@ -3139,19 +3446,13 @@
                             </w:pPr>
                             <w:r>
                               <w:rPr>
-                                <w:rFonts w:ascii="Arial" w:hAnsi="Arial"/>
-                                <w:sz w:val="18"/>
-                                <w:szCs w:val="18"/>
-                              </w:rPr>
-                              <w:t xml:space="preserve">5. El sistema </w:t>
-                            </w:r>
-                            <w:r>
-                              <w:rPr>
-                                <w:rFonts w:ascii="Arial" w:hAnsi="Arial"/>
-                                <w:sz w:val="18"/>
-                                <w:szCs w:val="18"/>
-                              </w:rPr>
-                              <w:t>muestra los taxis filtrados por barrio.</w:t>
+                                <w:rFonts w:eastAsia="Calibri" w:cs="" w:ascii="Arial" w:hAnsi="Arial"/>
+                                <w:kern w:val="0"/>
+                                <w:sz w:val="18"/>
+                                <w:szCs w:val="18"/>
+                                <w:lang w:val="es-ES" w:eastAsia="es-ES" w:bidi="ar-SA"/>
+                              </w:rPr>
+                              <w:t>5. El sistema muestra los taxis filtrados por barrio.</w:t>
                             </w:r>
                           </w:p>
                         </w:tc>
@@ -3170,6 +3471,9 @@
                           <w:p>
                             <w:pPr>
                               <w:pStyle w:val="Contenidodelatabla"/>
+                              <w:widowControl/>
+                              <w:suppressAutoHyphens w:val="true"/>
+                              <w:spacing w:before="0" w:after="0"/>
                               <w:ind w:hanging="0" w:left="0" w:right="0"/>
                               <w:jc w:val="center"/>
                               <w:rPr>
@@ -3180,9 +3484,11 @@
                             </w:pPr>
                             <w:r>
                               <w:rPr>
-                                <w:rFonts w:ascii="Arial" w:hAnsi="Arial"/>
-                                <w:sz w:val="18"/>
-                                <w:szCs w:val="18"/>
+                                <w:rFonts w:eastAsia="Calibri" w:cs="" w:ascii="Arial" w:hAnsi="Arial"/>
+                                <w:kern w:val="0"/>
+                                <w:sz w:val="18"/>
+                                <w:szCs w:val="18"/>
+                                <w:lang w:val="es-ES" w:eastAsia="es-ES" w:bidi="ar-SA"/>
                               </w:rPr>
                               <w:t>El sistema muestra sólo los taxis que se encuentren dentro del barrio ingresado como filtro por el Administrador de la Central.</w:t>
                             </w:r>
@@ -3190,6 +3496,15 @@
                         </w:tc>
                       </w:tr>
                     </w:tbl>
+                    <w:p>
+                      <w:pPr>
+                        <w:pStyle w:val="Contenidodelmarco"/>
+                        <w:rPr/>
+                      </w:pPr>
+                      <w:r>
+                        <w:rPr/>
+                      </w:r>
+                    </w:p>
                   </w:txbxContent>
                 </v:textbox>
                 <w10:wrap type="square"/>
@@ -3221,7 +3536,7 @@
         <w:gridCol w:w="1668"/>
         <w:gridCol w:w="2159"/>
         <w:gridCol w:w="4819"/>
-        <w:gridCol w:w="5104"/>
+        <w:gridCol w:w="5103"/>
       </w:tblGrid>
       <w:tr>
         <w:trPr>
@@ -3246,6 +3561,7 @@
             <w:pPr>
               <w:pStyle w:val="Normal"/>
               <w:widowControl/>
+              <w:suppressAutoHyphens w:val="true"/>
               <w:spacing w:before="0" w:after="0"/>
               <w:jc w:val="center"/>
               <w:rPr>
@@ -3282,6 +3598,7 @@
             <w:pPr>
               <w:pStyle w:val="Normal"/>
               <w:widowControl/>
+              <w:suppressAutoHyphens w:val="true"/>
               <w:spacing w:before="0" w:after="0"/>
               <w:jc w:val="center"/>
               <w:cnfStyle w:val="100000000000" w:firstRow="1" w:lastRow="0" w:firstColumn="0" w:lastColumn="0" w:oddVBand="0" w:evenVBand="0" w:oddHBand="0" w:evenHBand="0" w:firstRowFirstColumn="0" w:firstRowLastColumn="0" w:lastRowFirstColumn="0" w:lastRowLastColumn="0"/>
@@ -3319,6 +3636,7 @@
             <w:pPr>
               <w:pStyle w:val="Normal"/>
               <w:widowControl/>
+              <w:suppressAutoHyphens w:val="true"/>
               <w:spacing w:before="0" w:after="0"/>
               <w:jc w:val="center"/>
               <w:cnfStyle w:val="100000000000" w:firstRow="1" w:lastRow="0" w:firstColumn="0" w:lastColumn="0" w:oddVBand="0" w:evenVBand="0" w:oddHBand="0" w:evenHBand="0" w:firstRowFirstColumn="0" w:firstRowLastColumn="0" w:lastRowFirstColumn="0" w:lastRowLastColumn="0"/>
@@ -3356,6 +3674,7 @@
             <w:pPr>
               <w:pStyle w:val="Normal"/>
               <w:widowControl/>
+              <w:suppressAutoHyphens w:val="true"/>
               <w:spacing w:before="0" w:after="0"/>
               <w:jc w:val="center"/>
               <w:cnfStyle w:val="100000000000" w:firstRow="1" w:lastRow="0" w:firstColumn="0" w:lastColumn="0" w:oddVBand="0" w:evenVBand="0" w:oddHBand="0" w:evenHBand="0" w:firstRowFirstColumn="0" w:firstRowLastColumn="0" w:lastRowFirstColumn="0" w:lastRowLastColumn="0"/>
@@ -3393,6 +3712,7 @@
             <w:pPr>
               <w:pStyle w:val="Normal"/>
               <w:widowControl/>
+              <w:suppressAutoHyphens w:val="true"/>
               <w:spacing w:before="0" w:after="0"/>
               <w:jc w:val="center"/>
               <w:cnfStyle w:val="100000000000" w:firstRow="1" w:lastRow="0" w:firstColumn="0" w:lastColumn="0" w:oddVBand="0" w:evenVBand="0" w:oddHBand="0" w:evenHBand="0" w:firstRowFirstColumn="0" w:firstRowLastColumn="0" w:lastRowFirstColumn="0" w:lastRowLastColumn="0"/>
@@ -3416,7 +3736,7 @@
         </w:tc>
         <w:tc>
           <w:tcPr>
-            <w:tcW w:w="5104" w:type="dxa"/>
+            <w:tcW w:w="5103" w:type="dxa"/>
             <w:tcBorders>
               <w:top w:val="single" w:sz="8" w:space="0" w:color="FFFFFF"/>
               <w:left w:val="single" w:sz="8" w:space="0" w:color="FFFFFF"/>
@@ -3430,6 +3750,7 @@
             <w:pPr>
               <w:pStyle w:val="Normal"/>
               <w:widowControl/>
+              <w:suppressAutoHyphens w:val="true"/>
               <w:spacing w:before="0" w:after="0"/>
               <w:jc w:val="center"/>
               <w:cnfStyle w:val="100000000000" w:firstRow="1" w:lastRow="0" w:firstColumn="0" w:lastColumn="0" w:oddVBand="0" w:evenVBand="0" w:oddHBand="0" w:evenHBand="0" w:firstRowFirstColumn="0" w:firstRowLastColumn="0" w:lastRowFirstColumn="0" w:lastRowLastColumn="0"/>
@@ -3474,6 +3795,7 @@
             <w:pPr>
               <w:pStyle w:val="Normal"/>
               <w:widowControl/>
+              <w:suppressAutoHyphens w:val="true"/>
               <w:spacing w:before="0" w:after="0"/>
               <w:jc w:val="center"/>
               <w:rPr>
@@ -3516,6 +3838,7 @@
             <w:pPr>
               <w:pStyle w:val="Normal"/>
               <w:widowControl/>
+              <w:suppressAutoHyphens w:val="true"/>
               <w:spacing w:before="0" w:after="0"/>
               <w:jc w:val="center"/>
               <w:cnfStyle w:val="000000100000" w:firstRow="0" w:lastRow="0" w:firstColumn="0" w:lastColumn="0" w:oddVBand="0" w:evenVBand="0" w:oddHBand="1" w:evenHBand="0" w:firstRowFirstColumn="0" w:firstRowLastColumn="0" w:lastRowFirstColumn="0" w:lastRowLastColumn="0"/>
@@ -3554,6 +3877,7 @@
           <w:p>
             <w:pPr>
               <w:pStyle w:val="Normal"/>
+              <w:suppressAutoHyphens w:val="true"/>
               <w:bidi w:val="0"/>
               <w:jc w:val="center"/>
               <w:rPr>
@@ -3568,39 +3892,7 @@
                 <w:sz w:val="18"/>
                 <w:szCs w:val="18"/>
               </w:rPr>
-              <w:t xml:space="preserve">Filtrar </w:t>
-            </w:r>
-            <w:r>
-              <w:rPr>
-                <w:rFonts w:ascii="Arial" w:hAnsi="Arial"/>
-                <w:sz w:val="18"/>
-                <w:szCs w:val="18"/>
-              </w:rPr>
-              <w:t>taxis</w:t>
-            </w:r>
-            <w:r>
-              <w:rPr>
-                <w:rFonts w:ascii="Arial" w:hAnsi="Arial"/>
-                <w:sz w:val="18"/>
-                <w:szCs w:val="18"/>
-              </w:rPr>
-              <w:t xml:space="preserve"> por barrio </w:t>
-            </w:r>
-            <w:r>
-              <w:rPr>
-                <w:rFonts w:ascii="Arial" w:hAnsi="Arial"/>
-                <w:sz w:val="18"/>
-                <w:szCs w:val="18"/>
-              </w:rPr>
-              <w:t>in</w:t>
-            </w:r>
-            <w:r>
-              <w:rPr>
-                <w:rFonts w:ascii="Arial" w:hAnsi="Arial"/>
-                <w:sz w:val="18"/>
-                <w:szCs w:val="18"/>
-              </w:rPr>
-              <w:t xml:space="preserve">existente </w:t>
+              <w:t>Filtrar taxis por barrio inexistente</w:t>
             </w:r>
           </w:p>
         </w:tc>
@@ -3619,6 +3911,9 @@
           <w:p>
             <w:pPr>
               <w:pStyle w:val="Contenidodelatabla"/>
+              <w:widowControl/>
+              <w:suppressAutoHyphens w:val="true"/>
+              <w:spacing w:before="0" w:after="0"/>
               <w:ind w:hanging="0" w:left="0" w:right="0"/>
               <w:jc w:val="center"/>
               <w:rPr>
@@ -3629,27 +3924,13 @@
             </w:pPr>
             <w:r>
               <w:rPr>
-                <w:rFonts w:ascii="Arial" w:hAnsi="Arial"/>
-                <w:sz w:val="18"/>
-                <w:szCs w:val="18"/>
-              </w:rPr>
-              <w:t xml:space="preserve">El barrio </w:t>
-            </w:r>
-            <w:r>
-              <w:rPr>
-                <w:rFonts w:ascii="Arial" w:hAnsi="Arial"/>
-                <w:sz w:val="18"/>
-                <w:szCs w:val="18"/>
-              </w:rPr>
-              <w:t>no</w:t>
-            </w:r>
-            <w:r>
-              <w:rPr>
-                <w:rFonts w:ascii="Arial" w:hAnsi="Arial"/>
-                <w:sz w:val="18"/>
-                <w:szCs w:val="18"/>
-              </w:rPr>
-              <w:t xml:space="preserve"> debe estar registrado en el sistema</w:t>
+                <w:rFonts w:eastAsia="Calibri" w:cs="" w:ascii="Arial" w:hAnsi="Arial"/>
+                <w:kern w:val="0"/>
+                <w:sz w:val="18"/>
+                <w:szCs w:val="18"/>
+                <w:lang w:val="es-ES" w:eastAsia="es-ES" w:bidi="ar-SA"/>
+              </w:rPr>
+              <w:t>El barrio no debe estar registrado en el sistema</w:t>
             </w:r>
           </w:p>
         </w:tc>
@@ -3668,6 +3949,9 @@
           <w:p>
             <w:pPr>
               <w:pStyle w:val="Contenidodelatabla"/>
+              <w:widowControl/>
+              <w:suppressAutoHyphens w:val="true"/>
+              <w:spacing w:before="0" w:after="0"/>
               <w:ind w:hanging="0" w:left="0" w:right="0"/>
               <w:jc w:val="center"/>
               <w:rPr>
@@ -3678,16 +3962,45 @@
             </w:pPr>
             <w:r>
               <w:rPr>
+                <w:rFonts w:eastAsia="Calibri" w:cs="" w:ascii="Arial" w:hAnsi="Arial"/>
+                <w:kern w:val="0"/>
+                <w:sz w:val="18"/>
+                <w:szCs w:val="18"/>
+                <w:lang w:val="es-ES" w:eastAsia="es-ES" w:bidi="ar-SA"/>
+              </w:rPr>
+              <w:t>1. El Administrador de la Central selecciona la opción “Visualizar Mapa”</w:t>
+            </w:r>
+          </w:p>
+          <w:p>
+            <w:pPr>
+              <w:pStyle w:val="Contenidodelatabla"/>
+              <w:widowControl/>
+              <w:suppressAutoHyphens w:val="true"/>
+              <w:spacing w:before="0" w:after="0"/>
+              <w:ind w:hanging="0" w:left="0" w:right="0"/>
+              <w:jc w:val="center"/>
+              <w:rPr>
                 <w:rFonts w:ascii="Arial" w:hAnsi="Arial"/>
                 <w:sz w:val="18"/>
                 <w:szCs w:val="18"/>
               </w:rPr>
-              <w:t>1. El Administrador de la Central selecciona la opción “Visualizar Mapa”</w:t>
+            </w:pPr>
+            <w:r>
+              <w:rPr>
+                <w:rFonts w:eastAsia="Calibri" w:cs="" w:ascii="Arial" w:hAnsi="Arial"/>
+                <w:kern w:val="0"/>
+                <w:sz w:val="18"/>
+                <w:szCs w:val="18"/>
+                <w:lang w:val="es-ES" w:eastAsia="es-ES" w:bidi="ar-SA"/>
+              </w:rPr>
             </w:r>
           </w:p>
           <w:p>
             <w:pPr>
               <w:pStyle w:val="Contenidodelatabla"/>
+              <w:widowControl/>
+              <w:suppressAutoHyphens w:val="true"/>
+              <w:spacing w:before="0" w:after="0"/>
               <w:ind w:hanging="0" w:left="0" w:right="0"/>
               <w:jc w:val="center"/>
               <w:rPr>
@@ -3698,15 +4011,45 @@
             </w:pPr>
             <w:r>
               <w:rPr>
+                <w:rFonts w:eastAsia="Calibri" w:cs="" w:ascii="Arial" w:hAnsi="Arial"/>
+                <w:kern w:val="0"/>
+                <w:sz w:val="18"/>
+                <w:szCs w:val="18"/>
+                <w:lang w:val="es-ES" w:eastAsia="es-ES" w:bidi="ar-SA"/>
+              </w:rPr>
+              <w:t>2. El sistema muestra la opción para filtrar la visualización por “Barrio”.</w:t>
+            </w:r>
+          </w:p>
+          <w:p>
+            <w:pPr>
+              <w:pStyle w:val="Contenidodelatabla"/>
+              <w:widowControl/>
+              <w:suppressAutoHyphens w:val="true"/>
+              <w:spacing w:before="0" w:after="0"/>
+              <w:ind w:hanging="0" w:left="0" w:right="0"/>
+              <w:jc w:val="center"/>
+              <w:rPr>
                 <w:rFonts w:ascii="Arial" w:hAnsi="Arial"/>
                 <w:sz w:val="18"/>
                 <w:szCs w:val="18"/>
               </w:rPr>
+            </w:pPr>
+            <w:r>
+              <w:rPr>
+                <w:rFonts w:eastAsia="Calibri" w:cs="" w:ascii="Arial" w:hAnsi="Arial"/>
+                <w:kern w:val="0"/>
+                <w:sz w:val="18"/>
+                <w:szCs w:val="18"/>
+                <w:lang w:val="es-ES" w:eastAsia="es-ES" w:bidi="ar-SA"/>
+              </w:rPr>
             </w:r>
           </w:p>
           <w:p>
             <w:pPr>
               <w:pStyle w:val="Contenidodelatabla"/>
+              <w:widowControl/>
+              <w:suppressAutoHyphens w:val="true"/>
+              <w:spacing w:before="0" w:after="0"/>
               <w:ind w:hanging="0" w:left="0" w:right="0"/>
               <w:jc w:val="center"/>
               <w:rPr>
@@ -3717,64 +4060,19 @@
             </w:pPr>
             <w:r>
               <w:rPr>
-                <w:rFonts w:ascii="Arial" w:hAnsi="Arial"/>
-                <w:sz w:val="18"/>
-                <w:szCs w:val="18"/>
-              </w:rPr>
-              <w:t>2. El sistema muestra la opción para filtrar la visualización por “Barrio”.</w:t>
-            </w:r>
-          </w:p>
-          <w:p>
-            <w:pPr>
-              <w:pStyle w:val="Contenidodelatabla"/>
-              <w:ind w:hanging="0" w:left="0" w:right="0"/>
-              <w:jc w:val="center"/>
-              <w:rPr>
-                <w:rFonts w:ascii="Arial" w:hAnsi="Arial"/>
-                <w:sz w:val="18"/>
-                <w:szCs w:val="18"/>
-              </w:rPr>
-            </w:pPr>
-            <w:r>
-              <w:rPr>
-                <w:rFonts w:ascii="Arial" w:hAnsi="Arial"/>
-                <w:sz w:val="18"/>
-                <w:szCs w:val="18"/>
-              </w:rPr>
-            </w:r>
-          </w:p>
-          <w:p>
-            <w:pPr>
-              <w:pStyle w:val="Contenidodelatabla"/>
-              <w:ind w:hanging="0" w:left="0" w:right="0"/>
-              <w:jc w:val="center"/>
-              <w:rPr>
-                <w:rFonts w:ascii="Arial" w:hAnsi="Arial"/>
-                <w:sz w:val="18"/>
-                <w:szCs w:val="18"/>
-              </w:rPr>
-            </w:pPr>
-            <w:r>
-              <w:rPr>
-                <w:rFonts w:ascii="Arial" w:hAnsi="Arial"/>
-                <w:sz w:val="18"/>
-                <w:szCs w:val="18"/>
-              </w:rPr>
-              <w:t xml:space="preserve">3. El sistema solicita ingresar el nombre del barrio </w:t>
-            </w:r>
-            <w:r>
-              <w:rPr>
-                <w:rFonts w:ascii="Arial" w:hAnsi="Arial"/>
-                <w:sz w:val="18"/>
-                <w:szCs w:val="18"/>
-              </w:rPr>
-              <w:t>y no esta registrado</w:t>
+                <w:rFonts w:eastAsia="Calibri" w:cs="" w:ascii="Arial" w:hAnsi="Arial"/>
+                <w:kern w:val="0"/>
+                <w:sz w:val="18"/>
+                <w:szCs w:val="18"/>
+                <w:lang w:val="es-ES" w:eastAsia="es-ES" w:bidi="ar-SA"/>
+              </w:rPr>
+              <w:t>3. El sistema solicita ingresar el nombre del barrio y no esta registrado</w:t>
             </w:r>
           </w:p>
         </w:tc>
         <w:tc>
           <w:tcPr>
-            <w:tcW w:w="5104" w:type="dxa"/>
+            <w:tcW w:w="5103" w:type="dxa"/>
             <w:tcBorders>
               <w:top w:val="nil"/>
               <w:left w:val="single" w:sz="8" w:space="0" w:color="FFFFFF"/>
@@ -3787,6 +4085,9 @@
           <w:p>
             <w:pPr>
               <w:pStyle w:val="Contenidodelatabla"/>
+              <w:widowControl/>
+              <w:suppressAutoHyphens w:val="true"/>
+              <w:spacing w:before="0" w:after="0"/>
               <w:ind w:hanging="0" w:left="0" w:right="0"/>
               <w:jc w:val="center"/>
               <w:rPr>
@@ -3797,9 +4098,11 @@
             </w:pPr>
             <w:r>
               <w:rPr>
-                <w:rFonts w:ascii="Arial" w:hAnsi="Arial"/>
-                <w:sz w:val="18"/>
-                <w:szCs w:val="18"/>
+                <w:rFonts w:eastAsia="Calibri" w:cs="" w:ascii="Arial" w:hAnsi="Arial"/>
+                <w:kern w:val="0"/>
+                <w:sz w:val="18"/>
+                <w:szCs w:val="18"/>
+                <w:lang w:val="es-ES" w:eastAsia="es-ES" w:bidi="ar-SA"/>
               </w:rPr>
               <w:t>El sistema muestra un mensaje de error indicando que el barrio ingresado como filtro no es válido.</w:t>
             </w:r>
@@ -3828,6 +4131,7 @@
             <w:pPr>
               <w:pStyle w:val="Normal"/>
               <w:widowControl/>
+              <w:suppressAutoHyphens w:val="true"/>
               <w:spacing w:before="0" w:after="0"/>
               <w:jc w:val="center"/>
               <w:rPr>
@@ -3870,6 +4174,7 @@
             <w:pPr>
               <w:pStyle w:val="Normal"/>
               <w:widowControl/>
+              <w:suppressAutoHyphens w:val="true"/>
               <w:spacing w:before="0" w:after="0"/>
               <w:jc w:val="center"/>
               <w:cnfStyle w:val="000000100000" w:firstRow="0" w:lastRow="0" w:firstColumn="0" w:lastColumn="0" w:oddVBand="0" w:evenVBand="0" w:oddHBand="1" w:evenHBand="0" w:firstRowFirstColumn="0" w:firstRowLastColumn="0" w:lastRowFirstColumn="0" w:lastRowLastColumn="0"/>
@@ -3908,6 +4213,7 @@
           <w:p>
             <w:pPr>
               <w:pStyle w:val="Normal"/>
+              <w:suppressAutoHyphens w:val="true"/>
               <w:bidi w:val="0"/>
               <w:jc w:val="center"/>
               <w:rPr>
@@ -3922,39 +4228,7 @@
                 <w:sz w:val="18"/>
                 <w:szCs w:val="18"/>
               </w:rPr>
-              <w:t xml:space="preserve">Filtrar </w:t>
-            </w:r>
-            <w:r>
-              <w:rPr>
-                <w:rFonts w:ascii="Arial" w:hAnsi="Arial"/>
-                <w:sz w:val="18"/>
-                <w:szCs w:val="18"/>
-              </w:rPr>
-              <w:t>taxi</w:t>
-            </w:r>
-            <w:r>
-              <w:rPr>
-                <w:rFonts w:ascii="Arial" w:hAnsi="Arial"/>
-                <w:sz w:val="18"/>
-                <w:szCs w:val="18"/>
-              </w:rPr>
-              <w:t xml:space="preserve"> por </w:t>
-            </w:r>
-            <w:r>
-              <w:rPr>
-                <w:rFonts w:ascii="Arial" w:hAnsi="Arial"/>
-                <w:sz w:val="18"/>
-                <w:szCs w:val="18"/>
-              </w:rPr>
-              <w:t>número de chapa</w:t>
-            </w:r>
-            <w:r>
-              <w:rPr>
-                <w:rFonts w:ascii="Arial" w:hAnsi="Arial"/>
-                <w:sz w:val="18"/>
-                <w:szCs w:val="18"/>
-              </w:rPr>
-              <w:t xml:space="preserve"> </w:t>
+              <w:t>Filtrar taxi por número de chapa</w:t>
             </w:r>
           </w:p>
         </w:tc>
@@ -3973,6 +4247,9 @@
           <w:p>
             <w:pPr>
               <w:pStyle w:val="Contenidodelatabla"/>
+              <w:widowControl/>
+              <w:suppressAutoHyphens w:val="true"/>
+              <w:spacing w:before="0" w:after="0"/>
               <w:ind w:hanging="0" w:left="0" w:right="0"/>
               <w:jc w:val="center"/>
               <w:rPr>
@@ -3983,27 +4260,13 @@
             </w:pPr>
             <w:r>
               <w:rPr>
-                <w:rFonts w:ascii="Arial" w:hAnsi="Arial"/>
-                <w:sz w:val="18"/>
-                <w:szCs w:val="18"/>
-              </w:rPr>
-              <w:t xml:space="preserve">El </w:t>
-            </w:r>
-            <w:r>
-              <w:rPr>
-                <w:rFonts w:ascii="Arial" w:hAnsi="Arial"/>
-                <w:sz w:val="18"/>
-                <w:szCs w:val="18"/>
-              </w:rPr>
-              <w:t>número de chapa</w:t>
-            </w:r>
-            <w:r>
-              <w:rPr>
-                <w:rFonts w:ascii="Arial" w:hAnsi="Arial"/>
-                <w:sz w:val="18"/>
-                <w:szCs w:val="18"/>
-              </w:rPr>
-              <w:t xml:space="preserve"> debe estar registrado en el sistema</w:t>
+                <w:rFonts w:eastAsia="Calibri" w:cs="" w:ascii="Arial" w:hAnsi="Arial"/>
+                <w:kern w:val="0"/>
+                <w:sz w:val="18"/>
+                <w:szCs w:val="18"/>
+                <w:lang w:val="es-ES" w:eastAsia="es-ES" w:bidi="ar-SA"/>
+              </w:rPr>
+              <w:t>El número de chapa debe estar registrado en el sistema</w:t>
             </w:r>
           </w:p>
         </w:tc>
@@ -4022,6 +4285,9 @@
           <w:p>
             <w:pPr>
               <w:pStyle w:val="Contenidodelatabla"/>
+              <w:widowControl/>
+              <w:suppressAutoHyphens w:val="true"/>
+              <w:spacing w:before="0" w:after="0"/>
               <w:ind w:hanging="0" w:left="0" w:right="0"/>
               <w:jc w:val="center"/>
               <w:rPr>
@@ -4032,16 +4298,18 @@
             </w:pPr>
             <w:r>
               <w:rPr>
-                <w:rFonts w:ascii="Arial" w:hAnsi="Arial"/>
-                <w:sz w:val="18"/>
-                <w:szCs w:val="18"/>
+                <w:rFonts w:eastAsia="Calibri" w:cs="" w:ascii="Arial" w:hAnsi="Arial"/>
+                <w:kern w:val="0"/>
+                <w:sz w:val="18"/>
+                <w:szCs w:val="18"/>
+                <w:lang w:val="es-ES" w:eastAsia="es-ES" w:bidi="ar-SA"/>
               </w:rPr>
             </w:r>
           </w:p>
         </w:tc>
         <w:tc>
           <w:tcPr>
-            <w:tcW w:w="5104" w:type="dxa"/>
+            <w:tcW w:w="5103" w:type="dxa"/>
             <w:tcBorders>
               <w:top w:val="nil"/>
               <w:left w:val="single" w:sz="8" w:space="0" w:color="FFFFFF"/>
@@ -4054,6 +4322,9 @@
           <w:p>
             <w:pPr>
               <w:pStyle w:val="Contenidodelatabla"/>
+              <w:widowControl/>
+              <w:suppressAutoHyphens w:val="true"/>
+              <w:spacing w:before="0" w:after="0"/>
               <w:ind w:hanging="0" w:left="0" w:right="0"/>
               <w:jc w:val="center"/>
               <w:rPr>
@@ -4064,9 +4335,11 @@
             </w:pPr>
             <w:r>
               <w:rPr>
-                <w:rFonts w:ascii="Arial" w:hAnsi="Arial"/>
-                <w:sz w:val="18"/>
-                <w:szCs w:val="18"/>
+                <w:rFonts w:eastAsia="Calibri" w:cs="" w:ascii="Arial" w:hAnsi="Arial"/>
+                <w:kern w:val="0"/>
+                <w:sz w:val="18"/>
+                <w:szCs w:val="18"/>
+                <w:lang w:val="es-ES" w:eastAsia="es-ES" w:bidi="ar-SA"/>
               </w:rPr>
             </w:r>
           </w:p>
@@ -4094,6 +4367,7 @@
             <w:pPr>
               <w:pStyle w:val="Normal"/>
               <w:widowControl/>
+              <w:suppressAutoHyphens w:val="true"/>
               <w:spacing w:before="0" w:after="0"/>
               <w:jc w:val="center"/>
               <w:rPr>
@@ -4136,6 +4410,7 @@
             <w:pPr>
               <w:pStyle w:val="Normal"/>
               <w:widowControl/>
+              <w:suppressAutoHyphens w:val="true"/>
               <w:spacing w:before="0" w:after="0"/>
               <w:jc w:val="center"/>
               <w:cnfStyle w:val="000000100000" w:firstRow="0" w:lastRow="0" w:firstColumn="0" w:lastColumn="0" w:oddVBand="0" w:evenVBand="0" w:oddHBand="1" w:evenHBand="0" w:firstRowFirstColumn="0" w:firstRowLastColumn="0" w:lastRowFirstColumn="0" w:lastRowLastColumn="0"/>
@@ -4174,6 +4449,7 @@
           <w:p>
             <w:pPr>
               <w:pStyle w:val="Normal"/>
+              <w:suppressAutoHyphens w:val="true"/>
               <w:bidi w:val="0"/>
               <w:jc w:val="center"/>
               <w:rPr>
@@ -4188,55 +4464,7 @@
                 <w:sz w:val="18"/>
                 <w:szCs w:val="18"/>
               </w:rPr>
-              <w:t xml:space="preserve">Filtrar </w:t>
-            </w:r>
-            <w:r>
-              <w:rPr>
-                <w:rFonts w:ascii="Arial" w:hAnsi="Arial"/>
-                <w:sz w:val="18"/>
-                <w:szCs w:val="18"/>
-              </w:rPr>
-              <w:t>taxi</w:t>
-            </w:r>
-            <w:r>
-              <w:rPr>
-                <w:rFonts w:ascii="Arial" w:hAnsi="Arial"/>
-                <w:sz w:val="18"/>
-                <w:szCs w:val="18"/>
-              </w:rPr>
-              <w:t xml:space="preserve"> por </w:t>
-            </w:r>
-            <w:r>
-              <w:rPr>
-                <w:rFonts w:ascii="Arial" w:hAnsi="Arial"/>
-                <w:sz w:val="18"/>
-                <w:szCs w:val="18"/>
-              </w:rPr>
-              <w:t>número de chapa</w:t>
-            </w:r>
-            <w:r>
-              <w:rPr>
-                <w:rFonts w:ascii="Arial" w:hAnsi="Arial"/>
-                <w:sz w:val="18"/>
-                <w:szCs w:val="18"/>
-              </w:rPr>
-              <w:t xml:space="preserve"> </w:t>
-            </w:r>
-            <w:r>
-              <w:rPr>
-                <w:rFonts w:ascii="Arial" w:hAnsi="Arial"/>
-                <w:sz w:val="18"/>
-                <w:szCs w:val="18"/>
-              </w:rPr>
-              <w:t>in</w:t>
-            </w:r>
-            <w:r>
-              <w:rPr>
-                <w:rFonts w:ascii="Arial" w:hAnsi="Arial"/>
-                <w:sz w:val="18"/>
-                <w:szCs w:val="18"/>
-              </w:rPr>
-              <w:t xml:space="preserve">existente </w:t>
+              <w:t>Filtrar taxi por número de chapa inexistente</w:t>
             </w:r>
           </w:p>
         </w:tc>
@@ -4255,6 +4483,9 @@
           <w:p>
             <w:pPr>
               <w:pStyle w:val="Contenidodelatabla"/>
+              <w:widowControl/>
+              <w:suppressAutoHyphens w:val="true"/>
+              <w:spacing w:before="0" w:after="0"/>
               <w:ind w:hanging="0" w:left="0" w:right="0"/>
               <w:jc w:val="center"/>
               <w:rPr>
@@ -4265,43 +4496,13 @@
             </w:pPr>
             <w:r>
               <w:rPr>
-                <w:rFonts w:ascii="Arial" w:hAnsi="Arial"/>
-                <w:sz w:val="18"/>
-                <w:szCs w:val="18"/>
-              </w:rPr>
-              <w:t xml:space="preserve">El </w:t>
-            </w:r>
-            <w:r>
-              <w:rPr>
-                <w:rFonts w:ascii="Arial" w:hAnsi="Arial"/>
-                <w:sz w:val="18"/>
-                <w:szCs w:val="18"/>
-              </w:rPr>
-              <w:t>número de chapa</w:t>
-            </w:r>
-            <w:r>
-              <w:rPr>
-                <w:rFonts w:ascii="Arial" w:hAnsi="Arial"/>
-                <w:sz w:val="18"/>
-                <w:szCs w:val="18"/>
-              </w:rPr>
-              <w:t xml:space="preserve"> </w:t>
-            </w:r>
-            <w:r>
-              <w:rPr>
-                <w:rFonts w:ascii="Arial" w:hAnsi="Arial"/>
-                <w:sz w:val="18"/>
-                <w:szCs w:val="18"/>
-              </w:rPr>
-              <w:t>no</w:t>
-            </w:r>
-            <w:r>
-              <w:rPr>
-                <w:rFonts w:ascii="Arial" w:hAnsi="Arial"/>
-                <w:sz w:val="18"/>
-                <w:szCs w:val="18"/>
-              </w:rPr>
-              <w:t xml:space="preserve"> debe estar registrado en el sistema</w:t>
+                <w:rFonts w:eastAsia="Calibri" w:cs="" w:ascii="Arial" w:hAnsi="Arial"/>
+                <w:kern w:val="0"/>
+                <w:sz w:val="18"/>
+                <w:szCs w:val="18"/>
+                <w:lang w:val="es-ES" w:eastAsia="es-ES" w:bidi="ar-SA"/>
+              </w:rPr>
+              <w:t>El número de chapa no debe estar registrado en el sistema</w:t>
             </w:r>
           </w:p>
         </w:tc>
@@ -4320,6 +4521,9 @@
           <w:p>
             <w:pPr>
               <w:pStyle w:val="Contenidodelatabla"/>
+              <w:widowControl/>
+              <w:suppressAutoHyphens w:val="true"/>
+              <w:spacing w:before="0" w:after="0"/>
               <w:ind w:hanging="0" w:left="0" w:right="0"/>
               <w:jc w:val="center"/>
               <w:rPr>
@@ -4330,16 +4534,18 @@
             </w:pPr>
             <w:r>
               <w:rPr>
-                <w:rFonts w:ascii="Arial" w:hAnsi="Arial"/>
-                <w:sz w:val="18"/>
-                <w:szCs w:val="18"/>
+                <w:rFonts w:eastAsia="Calibri" w:cs="" w:ascii="Arial" w:hAnsi="Arial"/>
+                <w:kern w:val="0"/>
+                <w:sz w:val="18"/>
+                <w:szCs w:val="18"/>
+                <w:lang w:val="es-ES" w:eastAsia="es-ES" w:bidi="ar-SA"/>
               </w:rPr>
             </w:r>
           </w:p>
         </w:tc>
         <w:tc>
           <w:tcPr>
-            <w:tcW w:w="5104" w:type="dxa"/>
+            <w:tcW w:w="5103" w:type="dxa"/>
             <w:tcBorders>
               <w:top w:val="nil"/>
               <w:left w:val="single" w:sz="8" w:space="0" w:color="FFFFFF"/>
@@ -4352,6 +4558,9 @@
           <w:p>
             <w:pPr>
               <w:pStyle w:val="Contenidodelatabla"/>
+              <w:widowControl/>
+              <w:suppressAutoHyphens w:val="true"/>
+              <w:spacing w:before="0" w:after="0"/>
               <w:ind w:hanging="0" w:left="0" w:right="0"/>
               <w:jc w:val="center"/>
               <w:rPr>
@@ -4362,9 +4571,11 @@
             </w:pPr>
             <w:r>
               <w:rPr>
-                <w:rFonts w:ascii="Arial" w:hAnsi="Arial"/>
-                <w:sz w:val="18"/>
-                <w:szCs w:val="18"/>
+                <w:rFonts w:eastAsia="Calibri" w:cs="" w:ascii="Arial" w:hAnsi="Arial"/>
+                <w:kern w:val="0"/>
+                <w:sz w:val="18"/>
+                <w:szCs w:val="18"/>
+                <w:lang w:val="es-ES" w:eastAsia="es-ES" w:bidi="ar-SA"/>
               </w:rPr>
             </w:r>
           </w:p>
@@ -4392,6 +4603,7 @@
             <w:pPr>
               <w:pStyle w:val="Normal"/>
               <w:widowControl/>
+              <w:suppressAutoHyphens w:val="true"/>
               <w:spacing w:before="0" w:after="0"/>
               <w:jc w:val="center"/>
               <w:rPr>
@@ -4433,6 +4645,7 @@
             <w:pPr>
               <w:pStyle w:val="Normal"/>
               <w:widowControl/>
+              <w:suppressAutoHyphens w:val="true"/>
               <w:spacing w:before="0" w:after="0"/>
               <w:jc w:val="center"/>
               <w:cnfStyle w:val="000000100000" w:firstRow="0" w:lastRow="0" w:firstColumn="0" w:lastColumn="0" w:oddVBand="0" w:evenVBand="0" w:oddHBand="1" w:evenHBand="0" w:firstRowFirstColumn="0" w:firstRowLastColumn="0" w:lastRowFirstColumn="0" w:lastRowLastColumn="0"/>
@@ -4470,6 +4683,7 @@
           <w:p>
             <w:pPr>
               <w:pStyle w:val="Normal"/>
+              <w:suppressAutoHyphens w:val="true"/>
               <w:bidi w:val="0"/>
               <w:jc w:val="center"/>
               <w:rPr>
@@ -4502,6 +4716,9 @@
           <w:p>
             <w:pPr>
               <w:pStyle w:val="Contenidodelatabla"/>
+              <w:widowControl/>
+              <w:suppressAutoHyphens w:val="true"/>
+              <w:spacing w:before="0" w:after="0"/>
               <w:ind w:hanging="0" w:left="0" w:right="0"/>
               <w:jc w:val="center"/>
               <w:rPr>
@@ -4512,9 +4729,11 @@
             </w:pPr>
             <w:r>
               <w:rPr>
-                <w:rFonts w:ascii="Arial" w:hAnsi="Arial"/>
-                <w:sz w:val="18"/>
-                <w:szCs w:val="18"/>
+                <w:rFonts w:eastAsia="Calibri" w:cs="" w:ascii="Arial" w:hAnsi="Arial"/>
+                <w:kern w:val="0"/>
+                <w:sz w:val="18"/>
+                <w:szCs w:val="18"/>
+                <w:lang w:val="es-ES" w:eastAsia="es-ES" w:bidi="ar-SA"/>
               </w:rPr>
             </w:r>
           </w:p>
@@ -4534,6 +4753,9 @@
           <w:p>
             <w:pPr>
               <w:pStyle w:val="Contenidodelatabla"/>
+              <w:widowControl/>
+              <w:suppressAutoHyphens w:val="true"/>
+              <w:spacing w:before="0" w:after="0"/>
               <w:ind w:hanging="0" w:left="0" w:right="0"/>
               <w:jc w:val="center"/>
               <w:rPr>
@@ -4544,16 +4766,18 @@
             </w:pPr>
             <w:r>
               <w:rPr>
-                <w:rFonts w:ascii="Arial" w:hAnsi="Arial"/>
-                <w:sz w:val="18"/>
-                <w:szCs w:val="18"/>
+                <w:rFonts w:eastAsia="Calibri" w:cs="" w:ascii="Arial" w:hAnsi="Arial"/>
+                <w:kern w:val="0"/>
+                <w:sz w:val="18"/>
+                <w:szCs w:val="18"/>
+                <w:lang w:val="es-ES" w:eastAsia="es-ES" w:bidi="ar-SA"/>
               </w:rPr>
             </w:r>
           </w:p>
         </w:tc>
         <w:tc>
           <w:tcPr>
-            <w:tcW w:w="5104" w:type="dxa"/>
+            <w:tcW w:w="5103" w:type="dxa"/>
             <w:tcBorders>
               <w:top w:val="nil"/>
               <w:left w:val="single" w:sz="8" w:space="0" w:color="FFFFFF"/>
@@ -4566,6 +4790,9 @@
           <w:p>
             <w:pPr>
               <w:pStyle w:val="Contenidodelatabla"/>
+              <w:widowControl/>
+              <w:suppressAutoHyphens w:val="true"/>
+              <w:spacing w:before="0" w:after="0"/>
               <w:ind w:hanging="0" w:left="0" w:right="0"/>
               <w:jc w:val="center"/>
               <w:rPr>
@@ -4576,9 +4803,11 @@
             </w:pPr>
             <w:r>
               <w:rPr>
-                <w:rFonts w:ascii="Arial" w:hAnsi="Arial"/>
-                <w:sz w:val="18"/>
-                <w:szCs w:val="18"/>
+                <w:rFonts w:eastAsia="Calibri" w:cs="" w:ascii="Arial" w:hAnsi="Arial"/>
+                <w:kern w:val="0"/>
+                <w:sz w:val="18"/>
+                <w:szCs w:val="18"/>
+                <w:lang w:val="es-ES" w:eastAsia="es-ES" w:bidi="ar-SA"/>
               </w:rPr>
             </w:r>
           </w:p>
@@ -4600,6 +4829,7 @@
     <w:p>
       <w:pPr>
         <w:pStyle w:val="Normal"/>
+        <w:spacing w:before="0" w:after="0"/>
         <w:rPr>
           <w:lang w:val="es-AR"/>
         </w:rPr>
@@ -4627,7 +4857,7 @@
         <w:tblLook w:firstRow="1" w:noVBand="1" w:lastRow="0" w:firstColumn="1" w:lastColumn="0" w:noHBand="0" w:val="04a0"/>
       </w:tblPr>
       <w:tblGrid>
-        <w:gridCol w:w="2602"/>
+        <w:gridCol w:w="2601"/>
         <w:gridCol w:w="2602"/>
         <w:gridCol w:w="3807"/>
         <w:gridCol w:w="7149"/>
@@ -4640,7 +4870,7 @@
         </w:trPr>
         <w:tc>
           <w:tcPr>
-            <w:tcW w:w="2602" w:type="dxa"/>
+            <w:tcW w:w="2601" w:type="dxa"/>
             <w:cnfStyle w:val="001000000000" w:firstRow="0" w:lastRow="0" w:firstColumn="1" w:lastColumn="0" w:oddVBand="0" w:evenVBand="0" w:oddHBand="0" w:evenHBand="0" w:firstRowFirstColumn="0" w:firstRowLastColumn="0" w:lastRowFirstColumn="0" w:lastRowLastColumn="0"/>
             <w:tcBorders>
               <w:top w:val="single" w:sz="8" w:space="0" w:color="FFFFFF"/>
@@ -4655,6 +4885,7 @@
             <w:pPr>
               <w:pStyle w:val="Normal"/>
               <w:widowControl/>
+              <w:suppressAutoHyphens w:val="true"/>
               <w:spacing w:before="0" w:after="0"/>
               <w:jc w:val="center"/>
               <w:rPr>
@@ -4692,6 +4923,7 @@
             <w:pPr>
               <w:pStyle w:val="Normal"/>
               <w:widowControl/>
+              <w:suppressAutoHyphens w:val="true"/>
               <w:spacing w:before="0" w:after="0"/>
               <w:jc w:val="center"/>
               <w:rPr>
@@ -4728,6 +4960,7 @@
             <w:pPr>
               <w:pStyle w:val="Normal"/>
               <w:widowControl/>
+              <w:suppressAutoHyphens w:val="true"/>
               <w:spacing w:before="0" w:after="0"/>
               <w:jc w:val="center"/>
               <w:cnfStyle w:val="100000000000" w:firstRow="1" w:lastRow="0" w:firstColumn="0" w:lastColumn="0" w:oddVBand="0" w:evenVBand="0" w:oddHBand="0" w:evenHBand="0" w:firstRowFirstColumn="0" w:firstRowLastColumn="0" w:lastRowFirstColumn="0" w:lastRowLastColumn="0"/>
@@ -4765,6 +4998,7 @@
             <w:pPr>
               <w:pStyle w:val="Normal"/>
               <w:widowControl/>
+              <w:suppressAutoHyphens w:val="true"/>
               <w:spacing w:before="0" w:after="0"/>
               <w:jc w:val="center"/>
               <w:cnfStyle w:val="100000000000" w:firstRow="1" w:lastRow="0" w:firstColumn="0" w:lastColumn="0" w:oddVBand="0" w:evenVBand="0" w:oddHBand="0" w:evenHBand="0" w:firstRowFirstColumn="0" w:firstRowLastColumn="0" w:lastRowFirstColumn="0" w:lastRowLastColumn="0"/>
@@ -4794,7 +5028,7 @@
         </w:trPr>
         <w:tc>
           <w:tcPr>
-            <w:tcW w:w="2602" w:type="dxa"/>
+            <w:tcW w:w="2601" w:type="dxa"/>
             <w:cnfStyle w:val="001000000000" w:firstRow="0" w:lastRow="0" w:firstColumn="1" w:lastColumn="0" w:oddVBand="0" w:evenVBand="0" w:oddHBand="0" w:evenHBand="0" w:firstRowFirstColumn="0" w:firstRowLastColumn="0" w:lastRowFirstColumn="0" w:lastRowLastColumn="0"/>
             <w:tcBorders>
               <w:top w:val="single" w:sz="8" w:space="0" w:color="FFFFFF"/>
@@ -4809,6 +5043,7 @@
             <w:pPr>
               <w:pStyle w:val="Normal"/>
               <w:widowControl/>
+              <w:suppressAutoHyphens w:val="true"/>
               <w:spacing w:before="57" w:after="57"/>
               <w:jc w:val="center"/>
               <w:rPr>
@@ -4831,7 +5066,7 @@
                 <w:szCs w:val="18"/>
                 <w:lang w:bidi="ar-SA"/>
               </w:rPr>
-              <w:t xml:space="preserve">Estado del taxi (Libre, Solicitado, Ocupado, Fuera de servicio) </w:t>
+              <w:t>Estado del taxi</w:t>
             </w:r>
           </w:p>
         </w:tc>
@@ -4852,6 +5087,7 @@
             <w:pPr>
               <w:pStyle w:val="Normal"/>
               <w:widowControl/>
+              <w:suppressAutoHyphens w:val="true"/>
               <w:spacing w:before="57" w:after="57"/>
               <w:jc w:val="center"/>
               <w:rPr>
@@ -4896,6 +5132,7 @@
             <w:pPr>
               <w:pStyle w:val="Normal"/>
               <w:widowControl/>
+              <w:suppressAutoHyphens w:val="true"/>
               <w:spacing w:before="57" w:after="57"/>
               <w:jc w:val="center"/>
               <w:cnfStyle w:val="000000100000" w:firstRow="0" w:lastRow="0" w:firstColumn="0" w:lastColumn="0" w:oddVBand="0" w:evenVBand="0" w:oddHBand="1" w:evenHBand="0" w:firstRowFirstColumn="0" w:firstRowLastColumn="0" w:lastRowFirstColumn="0" w:lastRowLastColumn="0"/>
@@ -4934,6 +5171,7 @@
           <w:p>
             <w:pPr>
               <w:pStyle w:val="Normal"/>
+              <w:suppressAutoHyphens w:val="true"/>
               <w:bidi w:val="0"/>
               <w:spacing w:before="57" w:after="57"/>
               <w:jc w:val="center"/>
@@ -4973,7 +5211,7 @@
         </w:trPr>
         <w:tc>
           <w:tcPr>
-            <w:tcW w:w="2602" w:type="dxa"/>
+            <w:tcW w:w="2601" w:type="dxa"/>
             <w:cnfStyle w:val="001000000000" w:firstRow="0" w:lastRow="0" w:firstColumn="1" w:lastColumn="0" w:oddVBand="0" w:evenVBand="0" w:oddHBand="0" w:evenHBand="0" w:firstRowFirstColumn="0" w:firstRowLastColumn="0" w:lastRowFirstColumn="0" w:lastRowLastColumn="0"/>
             <w:tcBorders>
               <w:top w:val="nil"/>
@@ -4988,6 +5226,7 @@
             <w:pPr>
               <w:pStyle w:val="Normal"/>
               <w:widowControl/>
+              <w:suppressAutoHyphens w:val="true"/>
               <w:spacing w:before="57" w:after="57"/>
               <w:jc w:val="center"/>
               <w:rPr>
@@ -5031,6 +5270,7 @@
             <w:pPr>
               <w:pStyle w:val="Normal"/>
               <w:widowControl/>
+              <w:suppressAutoHyphens w:val="true"/>
               <w:spacing w:before="57" w:after="57"/>
               <w:jc w:val="center"/>
               <w:rPr>
@@ -5075,6 +5315,7 @@
             <w:pPr>
               <w:pStyle w:val="Normal"/>
               <w:widowControl/>
+              <w:suppressAutoHyphens w:val="true"/>
               <w:spacing w:before="57" w:after="57"/>
               <w:jc w:val="center"/>
               <w:cnfStyle w:val="000000100000" w:firstRow="0" w:lastRow="0" w:firstColumn="0" w:lastColumn="0" w:oddVBand="0" w:evenVBand="0" w:oddHBand="1" w:evenHBand="0" w:firstRowFirstColumn="0" w:firstRowLastColumn="0" w:lastRowFirstColumn="0" w:lastRowLastColumn="0"/>
@@ -5113,6 +5354,7 @@
           <w:p>
             <w:pPr>
               <w:pStyle w:val="Normal"/>
+              <w:suppressAutoHyphens w:val="true"/>
               <w:bidi w:val="0"/>
               <w:spacing w:before="57" w:after="57"/>
               <w:jc w:val="center"/>
@@ -5134,6 +5376,7 @@
           <w:p>
             <w:pPr>
               <w:pStyle w:val="Normal"/>
+              <w:suppressAutoHyphens w:val="true"/>
               <w:bidi w:val="0"/>
               <w:spacing w:before="57" w:after="57"/>
               <w:jc w:val="center"/>
@@ -5161,7 +5404,7 @@
         </w:trPr>
         <w:tc>
           <w:tcPr>
-            <w:tcW w:w="2602" w:type="dxa"/>
+            <w:tcW w:w="2601" w:type="dxa"/>
             <w:cnfStyle w:val="001000000000" w:firstRow="0" w:lastRow="0" w:firstColumn="1" w:lastColumn="0" w:oddVBand="0" w:evenVBand="0" w:oddHBand="0" w:evenHBand="0" w:firstRowFirstColumn="0" w:firstRowLastColumn="0" w:lastRowFirstColumn="0" w:lastRowLastColumn="0"/>
             <w:tcBorders>
               <w:top w:val="nil"/>
@@ -5176,6 +5419,7 @@
             <w:pPr>
               <w:pStyle w:val="Normal"/>
               <w:widowControl/>
+              <w:suppressAutoHyphens w:val="true"/>
               <w:spacing w:before="57" w:after="57"/>
               <w:jc w:val="center"/>
               <w:rPr>
@@ -5219,6 +5463,7 @@
             <w:pPr>
               <w:pStyle w:val="Normal"/>
               <w:widowControl/>
+              <w:suppressAutoHyphens w:val="true"/>
               <w:spacing w:before="57" w:after="57"/>
               <w:jc w:val="center"/>
               <w:rPr>
@@ -5263,6 +5508,7 @@
             <w:pPr>
               <w:pStyle w:val="Normal"/>
               <w:widowControl/>
+              <w:suppressAutoHyphens w:val="true"/>
               <w:spacing w:before="57" w:after="57"/>
               <w:jc w:val="center"/>
               <w:cnfStyle w:val="000000100000" w:firstRow="0" w:lastRow="0" w:firstColumn="0" w:lastColumn="0" w:oddVBand="0" w:evenVBand="0" w:oddHBand="1" w:evenHBand="0" w:firstRowFirstColumn="0" w:firstRowLastColumn="0" w:lastRowFirstColumn="0" w:lastRowLastColumn="0"/>
@@ -5301,6 +5547,7 @@
           <w:p>
             <w:pPr>
               <w:pStyle w:val="Normal"/>
+              <w:suppressAutoHyphens w:val="true"/>
               <w:bidi w:val="0"/>
               <w:spacing w:before="57" w:after="57"/>
               <w:jc w:val="center"/>
@@ -5322,6 +5569,7 @@
           <w:p>
             <w:pPr>
               <w:pStyle w:val="Normal"/>
+              <w:suppressAutoHyphens w:val="true"/>
               <w:bidi w:val="0"/>
               <w:spacing w:before="57" w:after="57"/>
               <w:jc w:val="center"/>
@@ -5349,7 +5597,7 @@
         </w:trPr>
         <w:tc>
           <w:tcPr>
-            <w:tcW w:w="2602" w:type="dxa"/>
+            <w:tcW w:w="2601" w:type="dxa"/>
             <w:cnfStyle w:val="001000000000" w:firstRow="0" w:lastRow="0" w:firstColumn="1" w:lastColumn="0" w:oddVBand="0" w:evenVBand="0" w:oddHBand="0" w:evenHBand="0" w:firstRowFirstColumn="0" w:firstRowLastColumn="0" w:lastRowFirstColumn="0" w:lastRowLastColumn="0"/>
             <w:tcBorders>
               <w:top w:val="nil"/>
@@ -5364,6 +5612,7 @@
             <w:pPr>
               <w:pStyle w:val="Normal"/>
               <w:widowControl/>
+              <w:suppressAutoHyphens w:val="true"/>
               <w:spacing w:before="57" w:after="57"/>
               <w:jc w:val="center"/>
               <w:rPr>
@@ -5407,6 +5656,7 @@
             <w:pPr>
               <w:pStyle w:val="Normal"/>
               <w:widowControl/>
+              <w:suppressAutoHyphens w:val="true"/>
               <w:spacing w:before="57" w:after="57"/>
               <w:jc w:val="center"/>
               <w:rPr>
@@ -5451,6 +5701,7 @@
             <w:pPr>
               <w:pStyle w:val="Normal"/>
               <w:widowControl/>
+              <w:suppressAutoHyphens w:val="true"/>
               <w:spacing w:before="57" w:after="57"/>
               <w:jc w:val="center"/>
               <w:cnfStyle w:val="000000100000" w:firstRow="0" w:lastRow="0" w:firstColumn="0" w:lastColumn="0" w:oddVBand="0" w:evenVBand="0" w:oddHBand="1" w:evenHBand="0" w:firstRowFirstColumn="0" w:firstRowLastColumn="0" w:lastRowFirstColumn="0" w:lastRowLastColumn="0"/>
@@ -5489,6 +5740,7 @@
           <w:p>
             <w:pPr>
               <w:pStyle w:val="Normal"/>
+              <w:suppressAutoHyphens w:val="true"/>
               <w:bidi w:val="0"/>
               <w:spacing w:before="57" w:after="57"/>
               <w:jc w:val="center"/>
@@ -5510,6 +5762,7 @@
           <w:p>
             <w:pPr>
               <w:pStyle w:val="Normal"/>
+              <w:suppressAutoHyphens w:val="true"/>
               <w:bidi w:val="0"/>
               <w:spacing w:before="57" w:after="57"/>
               <w:jc w:val="center"/>
@@ -5537,7 +5790,7 @@
         </w:trPr>
         <w:tc>
           <w:tcPr>
-            <w:tcW w:w="2602" w:type="dxa"/>
+            <w:tcW w:w="2601" w:type="dxa"/>
             <w:cnfStyle w:val="001000000000" w:firstRow="0" w:lastRow="0" w:firstColumn="1" w:lastColumn="0" w:oddVBand="0" w:evenVBand="0" w:oddHBand="0" w:evenHBand="0" w:firstRowFirstColumn="0" w:firstRowLastColumn="0" w:lastRowFirstColumn="0" w:lastRowLastColumn="0"/>
             <w:tcBorders>
               <w:top w:val="nil"/>
@@ -5552,6 +5805,7 @@
             <w:pPr>
               <w:pStyle w:val="Normal"/>
               <w:widowControl/>
+              <w:suppressAutoHyphens w:val="true"/>
               <w:spacing w:before="57" w:after="57"/>
               <w:jc w:val="center"/>
               <w:rPr>
@@ -5595,6 +5849,7 @@
             <w:pPr>
               <w:pStyle w:val="Normal"/>
               <w:widowControl/>
+              <w:suppressAutoHyphens w:val="true"/>
               <w:spacing w:before="57" w:after="57"/>
               <w:jc w:val="center"/>
               <w:rPr>
@@ -5639,6 +5894,7 @@
             <w:pPr>
               <w:pStyle w:val="Normal"/>
               <w:widowControl/>
+              <w:suppressAutoHyphens w:val="true"/>
               <w:spacing w:before="57" w:after="57"/>
               <w:jc w:val="center"/>
               <w:cnfStyle w:val="000000100000" w:firstRow="0" w:lastRow="0" w:firstColumn="0" w:lastColumn="0" w:oddVBand="0" w:evenVBand="0" w:oddHBand="1" w:evenHBand="0" w:firstRowFirstColumn="0" w:firstRowLastColumn="0" w:lastRowFirstColumn="0" w:lastRowLastColumn="0"/>
@@ -5677,6 +5933,7 @@
           <w:p>
             <w:pPr>
               <w:pStyle w:val="Normal"/>
+              <w:suppressAutoHyphens w:val="true"/>
               <w:bidi w:val="0"/>
               <w:spacing w:before="57" w:after="57"/>
               <w:jc w:val="center"/>
@@ -5692,12 +5949,13 @@
                 <w:sz w:val="18"/>
                 <w:szCs w:val="18"/>
               </w:rPr>
-              <w:t xml:space="preserve">- Taxi ocupado sin datos del pasajero </w:t>
-            </w:r>
-          </w:p>
-          <w:p>
-            <w:pPr>
-              <w:pStyle w:val="Normal"/>
+              <w:t>- Taxi ocupado sin datos del pasajero</w:t>
+            </w:r>
+          </w:p>
+          <w:p>
+            <w:pPr>
+              <w:pStyle w:val="Normal"/>
+              <w:suppressAutoHyphens w:val="true"/>
               <w:bidi w:val="0"/>
               <w:spacing w:before="57" w:after="57"/>
               <w:jc w:val="center"/>
@@ -5719,6 +5977,7 @@
           <w:p>
             <w:pPr>
               <w:pStyle w:val="Normal"/>
+              <w:suppressAutoHyphens w:val="true"/>
               <w:bidi w:val="0"/>
               <w:spacing w:before="57" w:after="57"/>
               <w:jc w:val="center"/>
@@ -5746,7 +6005,7 @@
         </w:trPr>
         <w:tc>
           <w:tcPr>
-            <w:tcW w:w="2602" w:type="dxa"/>
+            <w:tcW w:w="2601" w:type="dxa"/>
             <w:cnfStyle w:val="001000000000" w:firstRow="0" w:lastRow="0" w:firstColumn="1" w:lastColumn="0" w:oddVBand="0" w:evenVBand="0" w:oddHBand="0" w:evenHBand="0" w:firstRowFirstColumn="0" w:firstRowLastColumn="0" w:lastRowFirstColumn="0" w:lastRowLastColumn="0"/>
             <w:tcBorders>
               <w:top w:val="nil"/>
@@ -5761,6 +6020,7 @@
             <w:pPr>
               <w:pStyle w:val="Normal"/>
               <w:widowControl/>
+              <w:suppressAutoHyphens w:val="true"/>
               <w:spacing w:before="57" w:after="57"/>
               <w:jc w:val="center"/>
               <w:rPr>
@@ -5804,6 +6064,7 @@
             <w:pPr>
               <w:pStyle w:val="Normal"/>
               <w:widowControl/>
+              <w:suppressAutoHyphens w:val="true"/>
               <w:spacing w:before="57" w:after="57"/>
               <w:jc w:val="center"/>
               <w:rPr>
@@ -5848,6 +6109,7 @@
             <w:pPr>
               <w:pStyle w:val="Normal"/>
               <w:widowControl/>
+              <w:suppressAutoHyphens w:val="true"/>
               <w:spacing w:before="57" w:after="57"/>
               <w:jc w:val="center"/>
               <w:cnfStyle w:val="000000100000" w:firstRow="0" w:lastRow="0" w:firstColumn="0" w:lastColumn="0" w:oddVBand="0" w:evenVBand="0" w:oddHBand="1" w:evenHBand="0" w:firstRowFirstColumn="0" w:firstRowLastColumn="0" w:lastRowFirstColumn="0" w:lastRowLastColumn="0"/>
@@ -5867,8 +6129,25 @@
                 <w:szCs w:val="18"/>
                 <w:lang w:bidi="ar-SA"/>
               </w:rPr>
-              <w:t xml:space="preserve">- </w:t>
-            </w:r>
+              <w:t>- Barrio existente</w:t>
+            </w:r>
+          </w:p>
+          <w:p>
+            <w:pPr>
+              <w:pStyle w:val="Normal"/>
+              <w:widowControl/>
+              <w:suppressAutoHyphens w:val="true"/>
+              <w:spacing w:before="57" w:after="57"/>
+              <w:jc w:val="center"/>
+              <w:cnfStyle w:val="000000100000" w:firstRow="0" w:lastRow="0" w:firstColumn="0" w:lastColumn="0" w:oddVBand="0" w:evenVBand="0" w:oddHBand="1" w:evenHBand="0" w:firstRowFirstColumn="0" w:firstRowLastColumn="0" w:lastRowFirstColumn="0" w:lastRowLastColumn="0"/>
+              <w:rPr>
+                <w:rFonts w:ascii="Arial" w:hAnsi="Arial" w:cs="Calibri"/>
+                <w:kern w:val="0"/>
+                <w:sz w:val="18"/>
+                <w:szCs w:val="18"/>
+                <w:lang w:bidi="ar-SA"/>
+              </w:rPr>
+            </w:pPr>
             <w:r>
               <w:rPr>
                 <w:rFonts w:cs="Calibri" w:ascii="Arial" w:hAnsi="Arial"/>
@@ -5877,49 +6156,14 @@
                 <w:szCs w:val="18"/>
                 <w:lang w:bidi="ar-SA"/>
               </w:rPr>
-              <w:t>B</w:t>
-            </w:r>
-            <w:r>
-              <w:rPr>
-                <w:rFonts w:cs="Calibri" w:ascii="Arial" w:hAnsi="Arial"/>
-                <w:kern w:val="0"/>
-                <w:sz w:val="18"/>
-                <w:szCs w:val="18"/>
-                <w:lang w:bidi="ar-SA"/>
-              </w:rPr>
-              <w:t xml:space="preserve">arrio existente </w:t>
+              <w:t>- Estado de vehículo válido</w:t>
             </w:r>
           </w:p>
           <w:p>
             <w:pPr>
               <w:pStyle w:val="Normal"/>
               <w:widowControl/>
-              <w:spacing w:before="57" w:after="57"/>
-              <w:jc w:val="center"/>
-              <w:cnfStyle w:val="000000100000" w:firstRow="0" w:lastRow="0" w:firstColumn="0" w:lastColumn="0" w:oddVBand="0" w:evenVBand="0" w:oddHBand="1" w:evenHBand="0" w:firstRowFirstColumn="0" w:firstRowLastColumn="0" w:lastRowFirstColumn="0" w:lastRowLastColumn="0"/>
-              <w:rPr>
-                <w:rFonts w:ascii="Arial" w:hAnsi="Arial" w:cs="Calibri"/>
-                <w:kern w:val="0"/>
-                <w:sz w:val="18"/>
-                <w:szCs w:val="18"/>
-                <w:lang w:bidi="ar-SA"/>
-              </w:rPr>
-            </w:pPr>
-            <w:r>
-              <w:rPr>
-                <w:rFonts w:cs="Calibri" w:ascii="Arial" w:hAnsi="Arial"/>
-                <w:kern w:val="0"/>
-                <w:sz w:val="18"/>
-                <w:szCs w:val="18"/>
-                <w:lang w:bidi="ar-SA"/>
-              </w:rPr>
-              <w:t>- Estado de vehículo válido</w:t>
-            </w:r>
-          </w:p>
-          <w:p>
-            <w:pPr>
-              <w:pStyle w:val="Normal"/>
-              <w:widowControl/>
+              <w:suppressAutoHyphens w:val="true"/>
               <w:spacing w:before="57" w:after="57"/>
               <w:jc w:val="center"/>
               <w:cnfStyle w:val="000000100000" w:firstRow="0" w:lastRow="0" w:firstColumn="0" w:lastColumn="0" w:oddVBand="0" w:evenVBand="0" w:oddHBand="1" w:evenHBand="0" w:firstRowFirstColumn="0" w:firstRowLastColumn="0" w:lastRowFirstColumn="0" w:lastRowLastColumn="0"/>
@@ -5958,6 +6202,7 @@
           <w:p>
             <w:pPr>
               <w:pStyle w:val="Normal"/>
+              <w:suppressAutoHyphens w:val="true"/>
               <w:bidi w:val="0"/>
               <w:spacing w:before="57" w:after="57"/>
               <w:jc w:val="center"/>
@@ -5979,6 +6224,7 @@
           <w:p>
             <w:pPr>
               <w:pStyle w:val="Normal"/>
+              <w:suppressAutoHyphens w:val="true"/>
               <w:bidi w:val="0"/>
               <w:spacing w:before="57" w:after="57"/>
               <w:jc w:val="center"/>
@@ -6000,6 +6246,7 @@
           <w:p>
             <w:pPr>
               <w:pStyle w:val="Normal"/>
+              <w:suppressAutoHyphens w:val="true"/>
               <w:bidi w:val="0"/>
               <w:spacing w:before="57" w:after="57"/>
               <w:jc w:val="center"/>
@@ -6027,7 +6274,7 @@
         </w:trPr>
         <w:tc>
           <w:tcPr>
-            <w:tcW w:w="2602" w:type="dxa"/>
+            <w:tcW w:w="2601" w:type="dxa"/>
             <w:cnfStyle w:val="001000000000" w:firstRow="0" w:lastRow="0" w:firstColumn="1" w:lastColumn="0" w:oddVBand="0" w:evenVBand="0" w:oddHBand="0" w:evenHBand="0" w:firstRowFirstColumn="0" w:firstRowLastColumn="0" w:lastRowFirstColumn="0" w:lastRowLastColumn="0"/>
             <w:tcBorders>
               <w:top w:val="nil"/>
@@ -6042,6 +6289,7 @@
             <w:pPr>
               <w:pStyle w:val="Normal"/>
               <w:widowControl/>
+              <w:suppressAutoHyphens w:val="true"/>
               <w:spacing w:before="0" w:after="0"/>
               <w:jc w:val="center"/>
               <w:rPr>
@@ -6085,6 +6333,7 @@
             <w:pPr>
               <w:pStyle w:val="Normal"/>
               <w:widowControl/>
+              <w:suppressAutoHyphens w:val="true"/>
               <w:spacing w:before="0" w:after="0"/>
               <w:jc w:val="center"/>
               <w:rPr>
@@ -6129,6 +6378,7 @@
             <w:pPr>
               <w:pStyle w:val="Normal"/>
               <w:widowControl/>
+              <w:suppressAutoHyphens w:val="true"/>
               <w:spacing w:before="0" w:after="0"/>
               <w:jc w:val="center"/>
               <w:cnfStyle w:val="000000100000" w:firstRow="0" w:lastRow="0" w:firstColumn="0" w:lastColumn="0" w:oddVBand="0" w:evenVBand="0" w:oddHBand="1" w:evenHBand="0" w:firstRowFirstColumn="0" w:firstRowLastColumn="0" w:lastRowFirstColumn="0" w:lastRowLastColumn="0"/>
@@ -6167,6 +6417,7 @@
           <w:p>
             <w:pPr>
               <w:pStyle w:val="Normal"/>
+              <w:suppressAutoHyphens w:val="true"/>
               <w:bidi w:val="0"/>
               <w:jc w:val="center"/>
               <w:rPr>
@@ -6181,43 +6432,28 @@
                 <w:sz w:val="18"/>
                 <w:szCs w:val="18"/>
               </w:rPr>
-              <w:t xml:space="preserve">- </w:t>
-            </w:r>
-            <w:r>
+              <w:t>- Mapa no disponible</w:t>
+            </w:r>
+          </w:p>
+          <w:p>
+            <w:pPr>
+              <w:pStyle w:val="Normal"/>
+              <w:suppressAutoHyphens w:val="true"/>
+              <w:bidi w:val="0"/>
+              <w:jc w:val="center"/>
               <w:rPr>
                 <w:rFonts w:ascii="Arial" w:hAnsi="Arial"/>
                 <w:sz w:val="18"/>
                 <w:szCs w:val="18"/>
               </w:rPr>
-              <w:t>Mapa no disponible</w:t>
-            </w:r>
-          </w:p>
-          <w:p>
-            <w:pPr>
-              <w:pStyle w:val="Normal"/>
-              <w:bidi w:val="0"/>
-              <w:jc w:val="center"/>
+            </w:pPr>
+            <w:r>
               <w:rPr>
                 <w:rFonts w:ascii="Arial" w:hAnsi="Arial"/>
                 <w:sz w:val="18"/>
                 <w:szCs w:val="18"/>
               </w:rPr>
-            </w:pPr>
-            <w:r>
-              <w:rPr>
-                <w:rFonts w:ascii="Arial" w:hAnsi="Arial"/>
-                <w:sz w:val="18"/>
-                <w:szCs w:val="18"/>
-              </w:rPr>
-              <w:t xml:space="preserve">- </w:t>
-            </w:r>
-            <w:r>
-              <w:rPr>
-                <w:rFonts w:ascii="Arial" w:hAnsi="Arial"/>
-                <w:sz w:val="18"/>
-                <w:szCs w:val="18"/>
-              </w:rPr>
-              <w:t>Localización sin conexión</w:t>
+              <w:t>- Localización sin conexión</w:t>
             </w:r>
           </w:p>
         </w:tc>
@@ -6229,7 +6465,7 @@
         </w:trPr>
         <w:tc>
           <w:tcPr>
-            <w:tcW w:w="2602" w:type="dxa"/>
+            <w:tcW w:w="2601" w:type="dxa"/>
             <w:cnfStyle w:val="001000000000" w:firstRow="0" w:lastRow="0" w:firstColumn="1" w:lastColumn="0" w:oddVBand="0" w:evenVBand="0" w:oddHBand="0" w:evenHBand="0" w:firstRowFirstColumn="0" w:firstRowLastColumn="0" w:lastRowFirstColumn="0" w:lastRowLastColumn="0"/>
             <w:tcBorders>
               <w:top w:val="nil"/>
@@ -6244,6 +6480,7 @@
             <w:pPr>
               <w:pStyle w:val="Normal"/>
               <w:widowControl/>
+              <w:suppressAutoHyphens w:val="true"/>
               <w:spacing w:before="0" w:after="0"/>
               <w:jc w:val="center"/>
               <w:rPr>
@@ -6266,7 +6503,7 @@
                 <w:szCs w:val="18"/>
                 <w:lang w:bidi="ar-SA"/>
               </w:rPr>
-              <w:t xml:space="preserve">Visualización de taxis en el mapa </w:t>
+              <w:t>Visualización de taxis en el mapa</w:t>
             </w:r>
           </w:p>
         </w:tc>
@@ -6287,6 +6524,7 @@
             <w:pPr>
               <w:pStyle w:val="Normal"/>
               <w:widowControl/>
+              <w:suppressAutoHyphens w:val="true"/>
               <w:spacing w:before="0" w:after="0"/>
               <w:jc w:val="center"/>
               <w:rPr>
@@ -6331,6 +6569,7 @@
             <w:pPr>
               <w:pStyle w:val="Normal"/>
               <w:widowControl/>
+              <w:suppressAutoHyphens w:val="true"/>
               <w:spacing w:before="0" w:after="0"/>
               <w:jc w:val="center"/>
               <w:cnfStyle w:val="000000100000" w:firstRow="0" w:lastRow="0" w:firstColumn="0" w:lastColumn="0" w:oddVBand="0" w:evenVBand="0" w:oddHBand="1" w:evenHBand="0" w:firstRowFirstColumn="0" w:firstRowLastColumn="0" w:lastRowFirstColumn="0" w:lastRowLastColumn="0"/>
@@ -6369,6 +6608,7 @@
           <w:p>
             <w:pPr>
               <w:pStyle w:val="Normal"/>
+              <w:suppressAutoHyphens w:val="true"/>
               <w:bidi w:val="0"/>
               <w:jc w:val="center"/>
               <w:rPr>
@@ -6383,43 +6623,28 @@
                 <w:sz w:val="18"/>
                 <w:szCs w:val="18"/>
               </w:rPr>
-              <w:t xml:space="preserve">- </w:t>
-            </w:r>
-            <w:r>
+              <w:t>- Íconos no visibles</w:t>
+            </w:r>
+          </w:p>
+          <w:p>
+            <w:pPr>
+              <w:pStyle w:val="Normal"/>
+              <w:suppressAutoHyphens w:val="true"/>
+              <w:bidi w:val="0"/>
+              <w:jc w:val="center"/>
               <w:rPr>
                 <w:rFonts w:ascii="Arial" w:hAnsi="Arial"/>
                 <w:sz w:val="18"/>
                 <w:szCs w:val="18"/>
               </w:rPr>
-              <w:t>Íconos no visibles</w:t>
-            </w:r>
-          </w:p>
-          <w:p>
-            <w:pPr>
-              <w:pStyle w:val="Normal"/>
-              <w:bidi w:val="0"/>
-              <w:jc w:val="center"/>
+            </w:pPr>
+            <w:r>
               <w:rPr>
                 <w:rFonts w:ascii="Arial" w:hAnsi="Arial"/>
                 <w:sz w:val="18"/>
                 <w:szCs w:val="18"/>
               </w:rPr>
-            </w:pPr>
-            <w:r>
-              <w:rPr>
-                <w:rFonts w:ascii="Arial" w:hAnsi="Arial"/>
-                <w:sz w:val="18"/>
-                <w:szCs w:val="18"/>
-              </w:rPr>
-              <w:t xml:space="preserve">- </w:t>
-            </w:r>
-            <w:r>
-              <w:rPr>
-                <w:rFonts w:ascii="Arial" w:hAnsi="Arial"/>
-                <w:sz w:val="18"/>
-                <w:szCs w:val="18"/>
-              </w:rPr>
-              <w:t>Íconos con diferente color según su estado</w:t>
+              <w:t>- Íconos con diferente color según su estado</w:t>
             </w:r>
           </w:p>
         </w:tc>
@@ -6431,7 +6656,7 @@
         </w:trPr>
         <w:tc>
           <w:tcPr>
-            <w:tcW w:w="2602" w:type="dxa"/>
+            <w:tcW w:w="2601" w:type="dxa"/>
             <w:cnfStyle w:val="001000000000" w:firstRow="0" w:lastRow="0" w:firstColumn="1" w:lastColumn="0" w:oddVBand="0" w:evenVBand="0" w:oddHBand="0" w:evenHBand="0" w:firstRowFirstColumn="0" w:firstRowLastColumn="0" w:lastRowFirstColumn="0" w:lastRowLastColumn="0"/>
             <w:tcBorders>
               <w:top w:val="nil"/>
@@ -6446,6 +6671,7 @@
             <w:pPr>
               <w:pStyle w:val="Normal"/>
               <w:widowControl/>
+              <w:suppressAutoHyphens w:val="true"/>
               <w:spacing w:before="0" w:after="0"/>
               <w:jc w:val="center"/>
               <w:rPr>
@@ -6489,6 +6715,7 @@
             <w:pPr>
               <w:pStyle w:val="Normal"/>
               <w:widowControl/>
+              <w:suppressAutoHyphens w:val="true"/>
               <w:spacing w:before="0" w:after="0"/>
               <w:jc w:val="center"/>
               <w:rPr>
@@ -6533,6 +6760,7 @@
             <w:pPr>
               <w:pStyle w:val="Normal"/>
               <w:widowControl/>
+              <w:suppressAutoHyphens w:val="true"/>
               <w:spacing w:before="0" w:after="0"/>
               <w:jc w:val="center"/>
               <w:cnfStyle w:val="000000100000" w:firstRow="0" w:lastRow="0" w:firstColumn="0" w:lastColumn="0" w:oddVBand="0" w:evenVBand="0" w:oddHBand="1" w:evenHBand="0" w:firstRowFirstColumn="0" w:firstRowLastColumn="0" w:lastRowFirstColumn="0" w:lastRowLastColumn="0"/>
@@ -6552,7 +6780,7 @@
                 <w:szCs w:val="18"/>
                 <w:lang w:bidi="ar-SA"/>
               </w:rPr>
-              <w:t xml:space="preserve">Se muestra nombre, apellido y teléfono correctamente </w:t>
+              <w:t>Se muestra nombre, apellido y teléfono correctamente</w:t>
             </w:r>
           </w:p>
         </w:tc>
@@ -6571,6 +6799,7 @@
           <w:p>
             <w:pPr>
               <w:pStyle w:val="Normal"/>
+              <w:suppressAutoHyphens w:val="true"/>
               <w:bidi w:val="0"/>
               <w:jc w:val="center"/>
               <w:rPr>
@@ -6585,20 +6814,34 @@
                 <w:sz w:val="18"/>
                 <w:szCs w:val="18"/>
               </w:rPr>
-              <w:t xml:space="preserve">- </w:t>
-            </w:r>
-            <w:r>
+              <w:t>- No se muestran los datos del pasajero</w:t>
+            </w:r>
+          </w:p>
+          <w:p>
+            <w:pPr>
+              <w:pStyle w:val="Normal"/>
+              <w:suppressAutoHyphens w:val="true"/>
+              <w:bidi w:val="0"/>
+              <w:jc w:val="center"/>
               <w:rPr>
                 <w:rFonts w:ascii="Arial" w:hAnsi="Arial"/>
                 <w:sz w:val="18"/>
                 <w:szCs w:val="18"/>
               </w:rPr>
-              <w:t>No se muestran los datos del pasajero</w:t>
-            </w:r>
-          </w:p>
-          <w:p>
-            <w:pPr>
-              <w:pStyle w:val="Normal"/>
+            </w:pPr>
+            <w:r>
+              <w:rPr>
+                <w:rFonts w:ascii="Arial" w:hAnsi="Arial"/>
+                <w:sz w:val="18"/>
+                <w:szCs w:val="18"/>
+              </w:rPr>
+              <w:t>- Datos incompletos</w:t>
+            </w:r>
+          </w:p>
+          <w:p>
+            <w:pPr>
+              <w:pStyle w:val="Normal"/>
+              <w:suppressAutoHyphens w:val="true"/>
               <w:bidi w:val="0"/>
               <w:jc w:val="center"/>
               <w:rPr>
@@ -6613,43 +6856,7 @@
                 <w:sz w:val="18"/>
                 <w:szCs w:val="18"/>
               </w:rPr>
-              <w:t xml:space="preserve">- </w:t>
-            </w:r>
-            <w:r>
-              <w:rPr>
-                <w:rFonts w:ascii="Arial" w:hAnsi="Arial"/>
-                <w:sz w:val="18"/>
-                <w:szCs w:val="18"/>
-              </w:rPr>
-              <w:t>Datos incompletos</w:t>
-            </w:r>
-          </w:p>
-          <w:p>
-            <w:pPr>
-              <w:pStyle w:val="Normal"/>
-              <w:bidi w:val="0"/>
-              <w:jc w:val="center"/>
-              <w:rPr>
-                <w:rFonts w:ascii="Arial" w:hAnsi="Arial"/>
-                <w:sz w:val="18"/>
-                <w:szCs w:val="18"/>
-              </w:rPr>
-            </w:pPr>
-            <w:r>
-              <w:rPr>
-                <w:rFonts w:ascii="Arial" w:hAnsi="Arial"/>
-                <w:sz w:val="18"/>
-                <w:szCs w:val="18"/>
-              </w:rPr>
-              <w:t>-</w:t>
-            </w:r>
-            <w:r>
-              <w:rPr>
-                <w:rFonts w:ascii="Arial" w:hAnsi="Arial"/>
-                <w:sz w:val="18"/>
-                <w:szCs w:val="18"/>
-              </w:rPr>
-              <w:t>Datos erróneos</w:t>
+              <w:t>-Datos erróneos</w:t>
             </w:r>
           </w:p>
         </w:tc>
@@ -6661,7 +6868,7 @@
         </w:trPr>
         <w:tc>
           <w:tcPr>
-            <w:tcW w:w="2602" w:type="dxa"/>
+            <w:tcW w:w="2601" w:type="dxa"/>
             <w:cnfStyle w:val="001000000000" w:firstRow="0" w:lastRow="0" w:firstColumn="1" w:lastColumn="0" w:oddVBand="0" w:evenVBand="0" w:oddHBand="0" w:evenHBand="0" w:firstRowFirstColumn="0" w:firstRowLastColumn="0" w:lastRowFirstColumn="0" w:lastRowLastColumn="0"/>
             <w:tcBorders>
               <w:top w:val="nil"/>
@@ -6676,6 +6883,7 @@
             <w:pPr>
               <w:pStyle w:val="Normal"/>
               <w:widowControl/>
+              <w:suppressAutoHyphens w:val="true"/>
               <w:spacing w:before="0" w:after="0"/>
               <w:jc w:val="center"/>
               <w:rPr>
@@ -6719,6 +6927,7 @@
             <w:pPr>
               <w:pStyle w:val="Normal"/>
               <w:widowControl/>
+              <w:suppressAutoHyphens w:val="true"/>
               <w:spacing w:before="0" w:after="0"/>
               <w:jc w:val="center"/>
               <w:rPr>
@@ -6763,6 +6972,7 @@
             <w:pPr>
               <w:pStyle w:val="Normal"/>
               <w:widowControl/>
+              <w:suppressAutoHyphens w:val="true"/>
               <w:spacing w:before="0" w:after="0"/>
               <w:jc w:val="center"/>
               <w:cnfStyle w:val="000000100000" w:firstRow="0" w:lastRow="0" w:firstColumn="0" w:lastColumn="0" w:oddVBand="0" w:evenVBand="0" w:oddHBand="1" w:evenHBand="0" w:firstRowFirstColumn="0" w:firstRowLastColumn="0" w:lastRowFirstColumn="0" w:lastRowLastColumn="0"/>
@@ -6801,6 +7011,7 @@
           <w:p>
             <w:pPr>
               <w:pStyle w:val="Normal"/>
+              <w:suppressAutoHyphens w:val="true"/>
               <w:bidi w:val="0"/>
               <w:jc w:val="center"/>
               <w:rPr>
@@ -6815,43 +7026,28 @@
                 <w:sz w:val="18"/>
                 <w:szCs w:val="18"/>
               </w:rPr>
-              <w:t xml:space="preserve">- </w:t>
-            </w:r>
-            <w:r>
+              <w:t>- No se muestran datos del recorrido</w:t>
+            </w:r>
+          </w:p>
+          <w:p>
+            <w:pPr>
+              <w:pStyle w:val="Normal"/>
+              <w:suppressAutoHyphens w:val="true"/>
+              <w:bidi w:val="0"/>
+              <w:jc w:val="center"/>
               <w:rPr>
                 <w:rFonts w:ascii="Arial" w:hAnsi="Arial"/>
                 <w:sz w:val="18"/>
                 <w:szCs w:val="18"/>
               </w:rPr>
-              <w:t>No se muestran datos del recorrido</w:t>
-            </w:r>
-          </w:p>
-          <w:p>
-            <w:pPr>
-              <w:pStyle w:val="Normal"/>
-              <w:bidi w:val="0"/>
-              <w:jc w:val="center"/>
+            </w:pPr>
+            <w:r>
               <w:rPr>
                 <w:rFonts w:ascii="Arial" w:hAnsi="Arial"/>
                 <w:sz w:val="18"/>
                 <w:szCs w:val="18"/>
               </w:rPr>
-            </w:pPr>
-            <w:r>
-              <w:rPr>
-                <w:rFonts w:ascii="Arial" w:hAnsi="Arial"/>
-                <w:sz w:val="18"/>
-                <w:szCs w:val="18"/>
-              </w:rPr>
-              <w:t xml:space="preserve">- </w:t>
-            </w:r>
-            <w:r>
-              <w:rPr>
-                <w:rFonts w:ascii="Arial" w:hAnsi="Arial"/>
-                <w:sz w:val="18"/>
-                <w:szCs w:val="18"/>
-              </w:rPr>
-              <w:t>El taxi no está ocupado</w:t>
+              <w:t>- El taxi no está ocupado</w:t>
             </w:r>
           </w:p>
         </w:tc>
@@ -6863,7 +7059,7 @@
         </w:trPr>
         <w:tc>
           <w:tcPr>
-            <w:tcW w:w="2602" w:type="dxa"/>
+            <w:tcW w:w="2601" w:type="dxa"/>
             <w:cnfStyle w:val="001000000000" w:firstRow="0" w:lastRow="0" w:firstColumn="1" w:lastColumn="0" w:oddVBand="0" w:evenVBand="0" w:oddHBand="0" w:evenHBand="0" w:firstRowFirstColumn="0" w:firstRowLastColumn="0" w:lastRowFirstColumn="0" w:lastRowLastColumn="0"/>
             <w:tcBorders>
               <w:top w:val="nil"/>
@@ -6878,6 +7074,7 @@
             <w:pPr>
               <w:pStyle w:val="Normal"/>
               <w:widowControl/>
+              <w:suppressAutoHyphens w:val="true"/>
               <w:spacing w:before="0" w:after="0"/>
               <w:jc w:val="center"/>
               <w:rPr>
@@ -6921,6 +7118,7 @@
             <w:pPr>
               <w:pStyle w:val="Normal"/>
               <w:widowControl/>
+              <w:suppressAutoHyphens w:val="true"/>
               <w:spacing w:before="0" w:after="0"/>
               <w:jc w:val="center"/>
               <w:rPr>
@@ -6965,6 +7163,7 @@
             <w:pPr>
               <w:pStyle w:val="Normal"/>
               <w:widowControl/>
+              <w:suppressAutoHyphens w:val="true"/>
               <w:spacing w:before="0" w:after="0"/>
               <w:jc w:val="center"/>
               <w:cnfStyle w:val="000000100000" w:firstRow="0" w:lastRow="0" w:firstColumn="0" w:lastColumn="0" w:oddVBand="0" w:evenVBand="0" w:oddHBand="1" w:evenHBand="0" w:firstRowFirstColumn="0" w:firstRowLastColumn="0" w:lastRowFirstColumn="0" w:lastRowLastColumn="0"/>
@@ -7003,6 +7202,7 @@
           <w:p>
             <w:pPr>
               <w:pStyle w:val="Normal"/>
+              <w:suppressAutoHyphens w:val="true"/>
               <w:bidi w:val="0"/>
               <w:jc w:val="center"/>
               <w:rPr>
@@ -7017,20 +7217,34 @@
                 <w:sz w:val="18"/>
                 <w:szCs w:val="18"/>
               </w:rPr>
-              <w:t xml:space="preserve">- </w:t>
-            </w:r>
-            <w:r>
+              <w:t>- Se muestran taxis incorrectos</w:t>
+            </w:r>
+          </w:p>
+          <w:p>
+            <w:pPr>
+              <w:pStyle w:val="Normal"/>
+              <w:suppressAutoHyphens w:val="true"/>
+              <w:bidi w:val="0"/>
+              <w:jc w:val="center"/>
               <w:rPr>
                 <w:rFonts w:ascii="Arial" w:hAnsi="Arial"/>
                 <w:sz w:val="18"/>
                 <w:szCs w:val="18"/>
               </w:rPr>
-              <w:t>Se muestran taxis incorrectos</w:t>
-            </w:r>
-          </w:p>
-          <w:p>
-            <w:pPr>
-              <w:pStyle w:val="Normal"/>
+            </w:pPr>
+            <w:r>
+              <w:rPr>
+                <w:rFonts w:ascii="Arial" w:hAnsi="Arial"/>
+                <w:sz w:val="18"/>
+                <w:szCs w:val="18"/>
+              </w:rPr>
+              <w:t>- Se filtra por chapa no registrada</w:t>
+            </w:r>
+          </w:p>
+          <w:p>
+            <w:pPr>
+              <w:pStyle w:val="Normal"/>
+              <w:suppressAutoHyphens w:val="true"/>
               <w:bidi w:val="0"/>
               <w:jc w:val="center"/>
               <w:rPr>
@@ -7045,43 +7259,7 @@
                 <w:sz w:val="18"/>
                 <w:szCs w:val="18"/>
               </w:rPr>
-              <w:t xml:space="preserve">- </w:t>
-            </w:r>
-            <w:r>
-              <w:rPr>
-                <w:rFonts w:ascii="Arial" w:hAnsi="Arial"/>
-                <w:sz w:val="18"/>
-                <w:szCs w:val="18"/>
-              </w:rPr>
-              <w:t>Se filtra por chapa no registrada</w:t>
-            </w:r>
-          </w:p>
-          <w:p>
-            <w:pPr>
-              <w:pStyle w:val="Normal"/>
-              <w:bidi w:val="0"/>
-              <w:jc w:val="center"/>
-              <w:rPr>
-                <w:rFonts w:ascii="Arial" w:hAnsi="Arial"/>
-                <w:sz w:val="18"/>
-                <w:szCs w:val="18"/>
-              </w:rPr>
-            </w:pPr>
-            <w:r>
-              <w:rPr>
-                <w:rFonts w:ascii="Arial" w:hAnsi="Arial"/>
-                <w:sz w:val="18"/>
-                <w:szCs w:val="18"/>
-              </w:rPr>
-              <w:t xml:space="preserve">- </w:t>
-            </w:r>
-            <w:r>
-              <w:rPr>
-                <w:rFonts w:ascii="Arial" w:hAnsi="Arial"/>
-                <w:sz w:val="18"/>
-                <w:szCs w:val="18"/>
-              </w:rPr>
-              <w:t>Se filtra por barrio inexistente</w:t>
+              <w:t>- Se filtra por barrio inexistente</w:t>
             </w:r>
           </w:p>
         </w:tc>
@@ -7093,7 +7271,7 @@
         </w:trPr>
         <w:tc>
           <w:tcPr>
-            <w:tcW w:w="2602" w:type="dxa"/>
+            <w:tcW w:w="2601" w:type="dxa"/>
             <w:cnfStyle w:val="001000000000" w:firstRow="0" w:lastRow="0" w:firstColumn="1" w:lastColumn="0" w:oddVBand="0" w:evenVBand="0" w:oddHBand="0" w:evenHBand="0" w:firstRowFirstColumn="0" w:firstRowLastColumn="0" w:lastRowFirstColumn="0" w:lastRowLastColumn="0"/>
             <w:tcBorders>
               <w:top w:val="nil"/>
@@ -7108,6 +7286,7 @@
             <w:pPr>
               <w:pStyle w:val="Normal"/>
               <w:widowControl/>
+              <w:suppressAutoHyphens w:val="true"/>
               <w:spacing w:before="0" w:after="0"/>
               <w:jc w:val="center"/>
               <w:rPr>
@@ -7151,6 +7330,7 @@
             <w:pPr>
               <w:pStyle w:val="Normal"/>
               <w:widowControl/>
+              <w:suppressAutoHyphens w:val="true"/>
               <w:spacing w:before="0" w:after="0"/>
               <w:jc w:val="center"/>
               <w:rPr>
@@ -7195,6 +7375,7 @@
             <w:pPr>
               <w:pStyle w:val="Normal"/>
               <w:widowControl/>
+              <w:suppressAutoHyphens w:val="true"/>
               <w:spacing w:before="0" w:after="0"/>
               <w:jc w:val="center"/>
               <w:cnfStyle w:val="000000100000" w:firstRow="0" w:lastRow="0" w:firstColumn="0" w:lastColumn="0" w:oddVBand="0" w:evenVBand="0" w:oddHBand="1" w:evenHBand="0" w:firstRowFirstColumn="0" w:firstRowLastColumn="0" w:lastRowFirstColumn="0" w:lastRowLastColumn="0"/>
@@ -7233,6 +7414,7 @@
           <w:p>
             <w:pPr>
               <w:pStyle w:val="Normal"/>
+              <w:suppressAutoHyphens w:val="true"/>
               <w:bidi w:val="0"/>
               <w:jc w:val="center"/>
               <w:rPr>
@@ -7247,59 +7429,28 @@
                 <w:sz w:val="18"/>
                 <w:szCs w:val="18"/>
               </w:rPr>
-              <w:t xml:space="preserve">- </w:t>
-            </w:r>
-            <w:r>
+              <w:t>- Localización GPS inhabilitada</w:t>
+            </w:r>
+          </w:p>
+          <w:p>
+            <w:pPr>
+              <w:pStyle w:val="Normal"/>
+              <w:suppressAutoHyphens w:val="true"/>
+              <w:bidi w:val="0"/>
+              <w:jc w:val="center"/>
               <w:rPr>
                 <w:rFonts w:ascii="Arial" w:hAnsi="Arial"/>
                 <w:sz w:val="18"/>
                 <w:szCs w:val="18"/>
               </w:rPr>
-              <w:t>Localización GPS inhabilitada</w:t>
-            </w:r>
-          </w:p>
-          <w:p>
-            <w:pPr>
-              <w:pStyle w:val="Normal"/>
-              <w:bidi w:val="0"/>
-              <w:jc w:val="center"/>
+            </w:pPr>
+            <w:r>
               <w:rPr>
                 <w:rFonts w:ascii="Arial" w:hAnsi="Arial"/>
                 <w:sz w:val="18"/>
                 <w:szCs w:val="18"/>
               </w:rPr>
-            </w:pPr>
-            <w:r>
-              <w:rPr>
-                <w:rFonts w:ascii="Arial" w:hAnsi="Arial"/>
-                <w:sz w:val="18"/>
-                <w:szCs w:val="18"/>
-              </w:rPr>
-              <w:t xml:space="preserve">- </w:t>
-            </w:r>
-            <w:r>
-              <w:rPr>
-                <w:rFonts w:ascii="Arial" w:hAnsi="Arial"/>
-                <w:sz w:val="18"/>
-                <w:szCs w:val="18"/>
-              </w:rPr>
-              <w:t>Er</w:t>
-            </w:r>
-            <w:r>
-              <w:rPr>
-                <w:rFonts w:ascii="Arial" w:hAnsi="Arial"/>
-                <w:sz w:val="18"/>
-                <w:szCs w:val="18"/>
-              </w:rPr>
-              <w:t>r</w:t>
-            </w:r>
-            <w:r>
-              <w:rPr>
-                <w:rFonts w:ascii="Arial" w:hAnsi="Arial"/>
-                <w:sz w:val="18"/>
-                <w:szCs w:val="18"/>
-              </w:rPr>
-              <w:t>ores de sincronización</w:t>
+              <w:t>- Errores de sincronización</w:t>
             </w:r>
           </w:p>
         </w:tc>
@@ -7732,12 +7883,13 @@
     <w:rsid w:val="00b46c55"/>
     <w:pPr>
       <w:widowControl/>
+      <w:suppressAutoHyphens w:val="true"/>
       <w:bidi w:val="0"/>
       <w:spacing w:before="0" w:after="0"/>
       <w:jc w:val="both"/>
     </w:pPr>
     <w:rPr>
-      <w:rFonts w:eastAsia="" w:eastAsiaTheme="minorEastAsia" w:ascii="Calibri" w:hAnsi="Calibri" w:cs=""/>
+      <w:rFonts w:ascii="Calibri" w:hAnsi="Calibri" w:eastAsia="" w:cs="" w:eastAsiaTheme="minorEastAsia"/>
       <w:color w:val="auto"/>
       <w:kern w:val="0"/>
       <w:sz w:val="20"/>

</xml_diff>